<commit_message>
Actualiza documento de diseño y documentación
</commit_message>
<xml_diff>
--- a/documentacion/Diseño del sistema de gestión de incidencias.docx
+++ b/documentacion/Diseño del sistema de gestión de incidencias.docx
@@ -795,21 +795,12 @@
           <w:lang w:val="pt-BR" w:eastAsia="es-GT"/>
         </w:rPr>
       </w:pPr>
-      <w:proofErr w:type="spellStart"/>
       <w:r>
         <w:rPr>
           <w:rFonts w:eastAsia="Times New Roman" w:cs="Times New Roman"/>
           <w:lang w:val="pt-BR" w:eastAsia="es-GT"/>
         </w:rPr>
-        <w:t>Julio</w:t>
-      </w:r>
-      <w:proofErr w:type="spellEnd"/>
-      <w:r>
-        <w:rPr>
-          <w:rFonts w:eastAsia="Times New Roman" w:cs="Times New Roman"/>
-          <w:lang w:val="pt-BR" w:eastAsia="es-GT"/>
-        </w:rPr>
-        <w:t xml:space="preserve"> Edgar Barreda Ramírez (Docente)</w:t>
+        <w:t>Julio Edgar Barreda Ramírez (Docente)</w:t>
       </w:r>
     </w:p>
     <w:p>
@@ -935,7 +926,7 @@
             </w:rPr>
             <w:fldChar w:fldCharType="separate"/>
           </w:r>
-          <w:hyperlink w:anchor="_Toc244293408" w:history="1">
+          <w:hyperlink w:anchor="_Toc244295204" w:history="1">
             <w:r>
               <w:rPr>
                 <w:rStyle w:val="Hipervnculo"/>
@@ -964,7 +955,7 @@
                 <w:noProof/>
                 <w:webHidden/>
               </w:rPr>
-              <w:instrText xml:space="preserve"> PAGEREF _Toc244293408 \h </w:instrText>
+              <w:instrText xml:space="preserve"> PAGEREF _Toc244295204 \h </w:instrText>
             </w:r>
             <w:r>
               <w:rPr>
@@ -1011,7 +1002,7 @@
               <w:lang w:eastAsia="es-GT"/>
             </w:rPr>
           </w:pPr>
-          <w:hyperlink w:anchor="_Toc244293409" w:history="1">
+          <w:hyperlink w:anchor="_Toc244295205" w:history="1">
             <w:r>
               <w:rPr>
                 <w:rStyle w:val="Hipervnculo"/>
@@ -1039,7 +1030,7 @@
                 <w:noProof/>
                 <w:webHidden/>
               </w:rPr>
-              <w:instrText xml:space="preserve"> PAGEREF _Toc244293409 \h </w:instrText>
+              <w:instrText xml:space="preserve"> PAGEREF _Toc244295205 \h </w:instrText>
             </w:r>
             <w:r>
               <w:rPr>
@@ -1082,7 +1073,7 @@
               <w:lang w:eastAsia="es-GT"/>
             </w:rPr>
           </w:pPr>
-          <w:hyperlink w:anchor="_Toc244293410" w:history="1">
+          <w:hyperlink w:anchor="_Toc244295206" w:history="1">
             <w:r>
               <w:rPr>
                 <w:rStyle w:val="Hipervnculo"/>
@@ -1110,7 +1101,7 @@
                 <w:noProof/>
                 <w:webHidden/>
               </w:rPr>
-              <w:instrText xml:space="preserve"> PAGEREF _Toc244293410 \h </w:instrText>
+              <w:instrText xml:space="preserve"> PAGEREF _Toc244295206 \h </w:instrText>
             </w:r>
             <w:r>
               <w:rPr>
@@ -1153,7 +1144,7 @@
               <w:lang w:eastAsia="es-GT"/>
             </w:rPr>
           </w:pPr>
-          <w:hyperlink w:anchor="_Toc244293411" w:history="1">
+          <w:hyperlink w:anchor="_Toc244295207" w:history="1">
             <w:r>
               <w:rPr>
                 <w:rStyle w:val="Hipervnculo"/>
@@ -1181,7 +1172,7 @@
                 <w:noProof/>
                 <w:webHidden/>
               </w:rPr>
-              <w:instrText xml:space="preserve"> PAGEREF _Toc244293411 \h </w:instrText>
+              <w:instrText xml:space="preserve"> PAGEREF _Toc244295207 \h </w:instrText>
             </w:r>
             <w:r>
               <w:rPr>
@@ -1224,7 +1215,7 @@
               <w:lang w:eastAsia="es-GT"/>
             </w:rPr>
           </w:pPr>
-          <w:hyperlink w:anchor="_Toc244293412" w:history="1">
+          <w:hyperlink w:anchor="_Toc244295208" w:history="1">
             <w:r>
               <w:rPr>
                 <w:rStyle w:val="Hipervnculo"/>
@@ -1252,7 +1243,7 @@
                 <w:noProof/>
                 <w:webHidden/>
               </w:rPr>
-              <w:instrText xml:space="preserve"> PAGEREF _Toc244293412 \h </w:instrText>
+              <w:instrText xml:space="preserve"> PAGEREF _Toc244295208 \h </w:instrText>
             </w:r>
             <w:r>
               <w:rPr>
@@ -1295,7 +1286,7 @@
               <w:lang w:eastAsia="es-GT"/>
             </w:rPr>
           </w:pPr>
-          <w:hyperlink w:anchor="_Toc244293413" w:history="1">
+          <w:hyperlink w:anchor="_Toc244295209" w:history="1">
             <w:r>
               <w:rPr>
                 <w:rStyle w:val="Hipervnculo"/>
@@ -1323,7 +1314,7 @@
                 <w:noProof/>
                 <w:webHidden/>
               </w:rPr>
-              <w:instrText xml:space="preserve"> PAGEREF _Toc244293413 \h </w:instrText>
+              <w:instrText xml:space="preserve"> PAGEREF _Toc244295209 \h </w:instrText>
             </w:r>
             <w:r>
               <w:rPr>
@@ -1366,7 +1357,7 @@
               <w:lang w:eastAsia="es-GT"/>
             </w:rPr>
           </w:pPr>
-          <w:hyperlink w:anchor="_Toc244293414" w:history="1">
+          <w:hyperlink w:anchor="_Toc244295210" w:history="1">
             <w:r>
               <w:rPr>
                 <w:rStyle w:val="Hipervnculo"/>
@@ -1394,7 +1385,7 @@
                 <w:noProof/>
                 <w:webHidden/>
               </w:rPr>
-              <w:instrText xml:space="preserve"> PAGEREF _Toc244293414 \h </w:instrText>
+              <w:instrText xml:space="preserve"> PAGEREF _Toc244295210 \h </w:instrText>
             </w:r>
             <w:r>
               <w:rPr>
@@ -1437,7 +1428,7 @@
               <w:lang w:eastAsia="es-GT"/>
             </w:rPr>
           </w:pPr>
-          <w:hyperlink w:anchor="_Toc244293415" w:history="1">
+          <w:hyperlink w:anchor="_Toc244295211" w:history="1">
             <w:r>
               <w:rPr>
                 <w:rStyle w:val="Hipervnculo"/>
@@ -1465,7 +1456,7 @@
                 <w:noProof/>
                 <w:webHidden/>
               </w:rPr>
-              <w:instrText xml:space="preserve"> PAGEREF _Toc244293415 \h </w:instrText>
+              <w:instrText xml:space="preserve"> PAGEREF _Toc244295211 \h </w:instrText>
             </w:r>
             <w:r>
               <w:rPr>
@@ -1508,7 +1499,7 @@
               <w:lang w:eastAsia="es-GT"/>
             </w:rPr>
           </w:pPr>
-          <w:hyperlink w:anchor="_Toc244293416" w:history="1">
+          <w:hyperlink w:anchor="_Toc244295212" w:history="1">
             <w:r>
               <w:rPr>
                 <w:rStyle w:val="Hipervnculo"/>
@@ -1536,7 +1527,7 @@
                 <w:noProof/>
                 <w:webHidden/>
               </w:rPr>
-              <w:instrText xml:space="preserve"> PAGEREF _Toc244293416 \h </w:instrText>
+              <w:instrText xml:space="preserve"> PAGEREF _Toc244295212 \h </w:instrText>
             </w:r>
             <w:r>
               <w:rPr>
@@ -1579,7 +1570,7 @@
               <w:lang w:eastAsia="es-GT"/>
             </w:rPr>
           </w:pPr>
-          <w:hyperlink w:anchor="_Toc244293417" w:history="1">
+          <w:hyperlink w:anchor="_Toc244295213" w:history="1">
             <w:r>
               <w:rPr>
                 <w:rStyle w:val="Hipervnculo"/>
@@ -1607,7 +1598,7 @@
                 <w:noProof/>
                 <w:webHidden/>
               </w:rPr>
-              <w:instrText xml:space="preserve"> PAGEREF _Toc244293417 \h </w:instrText>
+              <w:instrText xml:space="preserve"> PAGEREF _Toc244295213 \h </w:instrText>
             </w:r>
             <w:r>
               <w:rPr>
@@ -1650,14 +1641,14 @@
               <w:lang w:eastAsia="es-GT"/>
             </w:rPr>
           </w:pPr>
-          <w:hyperlink w:anchor="_Toc244293418" w:history="1">
+          <w:hyperlink w:anchor="_Toc244295214" w:history="1">
             <w:r>
               <w:rPr>
                 <w:rStyle w:val="Hipervnculo"/>
                 <w:noProof/>
                 <w:lang w:eastAsia="es-MX"/>
               </w:rPr>
-              <w:t>Como leer el diccionario</w:t>
+              <w:t>Cómo leer el diccionario</w:t>
             </w:r>
             <w:r>
               <w:rPr>
@@ -1678,7 +1669,7 @@
                 <w:noProof/>
                 <w:webHidden/>
               </w:rPr>
-              <w:instrText xml:space="preserve"> PAGEREF _Toc244293418 \h </w:instrText>
+              <w:instrText xml:space="preserve"> PAGEREF _Toc244295214 \h </w:instrText>
             </w:r>
             <w:r>
               <w:rPr>
@@ -1721,7 +1712,7 @@
               <w:lang w:eastAsia="es-GT"/>
             </w:rPr>
           </w:pPr>
-          <w:hyperlink w:anchor="_Toc244293419" w:history="1">
+          <w:hyperlink w:anchor="_Toc244295215" w:history="1">
             <w:r>
               <w:rPr>
                 <w:rStyle w:val="Hipervnculo"/>
@@ -1749,7 +1740,7 @@
                 <w:noProof/>
                 <w:webHidden/>
               </w:rPr>
-              <w:instrText xml:space="preserve"> PAGEREF _Toc244293419 \h </w:instrText>
+              <w:instrText xml:space="preserve"> PAGEREF _Toc244295215 \h </w:instrText>
             </w:r>
             <w:r>
               <w:rPr>
@@ -1792,7 +1783,7 @@
               <w:lang w:eastAsia="es-GT"/>
             </w:rPr>
           </w:pPr>
-          <w:hyperlink w:anchor="_Toc244293420" w:history="1">
+          <w:hyperlink w:anchor="_Toc244295216" w:history="1">
             <w:r>
               <w:rPr>
                 <w:rStyle w:val="Hipervnculo"/>
@@ -1820,7 +1811,7 @@
                 <w:noProof/>
                 <w:webHidden/>
               </w:rPr>
-              <w:instrText xml:space="preserve"> PAGEREF _Toc244293420 \h </w:instrText>
+              <w:instrText xml:space="preserve"> PAGEREF _Toc244295216 \h </w:instrText>
             </w:r>
             <w:r>
               <w:rPr>
@@ -1863,7 +1854,7 @@
               <w:lang w:eastAsia="es-GT"/>
             </w:rPr>
           </w:pPr>
-          <w:hyperlink w:anchor="_Toc244293421" w:history="1">
+          <w:hyperlink w:anchor="_Toc244295217" w:history="1">
             <w:r>
               <w:rPr>
                 <w:rStyle w:val="Hipervnculo"/>
@@ -1891,7 +1882,7 @@
                 <w:noProof/>
                 <w:webHidden/>
               </w:rPr>
-              <w:instrText xml:space="preserve"> PAGEREF _Toc244293421 \h </w:instrText>
+              <w:instrText xml:space="preserve"> PAGEREF _Toc244295217 \h </w:instrText>
             </w:r>
             <w:r>
               <w:rPr>
@@ -1934,7 +1925,7 @@
               <w:lang w:eastAsia="es-GT"/>
             </w:rPr>
           </w:pPr>
-          <w:hyperlink w:anchor="_Toc244293422" w:history="1">
+          <w:hyperlink w:anchor="_Toc244295218" w:history="1">
             <w:r>
               <w:rPr>
                 <w:rStyle w:val="Hipervnculo"/>
@@ -1962,7 +1953,7 @@
                 <w:noProof/>
                 <w:webHidden/>
               </w:rPr>
-              <w:instrText xml:space="preserve"> PAGEREF _Toc244293422 \h </w:instrText>
+              <w:instrText xml:space="preserve"> PAGEREF _Toc244295218 \h </w:instrText>
             </w:r>
             <w:r>
               <w:rPr>
@@ -2005,7 +1996,7 @@
               <w:lang w:eastAsia="es-GT"/>
             </w:rPr>
           </w:pPr>
-          <w:hyperlink w:anchor="_Toc244293423" w:history="1">
+          <w:hyperlink w:anchor="_Toc244295219" w:history="1">
             <w:r>
               <w:rPr>
                 <w:rStyle w:val="Hipervnculo"/>
@@ -2033,7 +2024,7 @@
                 <w:noProof/>
                 <w:webHidden/>
               </w:rPr>
-              <w:instrText xml:space="preserve"> PAGEREF _Toc244293423 \h </w:instrText>
+              <w:instrText xml:space="preserve"> PAGEREF _Toc244295219 \h </w:instrText>
             </w:r>
             <w:r>
               <w:rPr>
@@ -2076,7 +2067,7 @@
               <w:lang w:eastAsia="es-GT"/>
             </w:rPr>
           </w:pPr>
-          <w:hyperlink w:anchor="_Toc244293424" w:history="1">
+          <w:hyperlink w:anchor="_Toc244295220" w:history="1">
             <w:r>
               <w:rPr>
                 <w:rStyle w:val="Hipervnculo"/>
@@ -2104,7 +2095,7 @@
                 <w:noProof/>
                 <w:webHidden/>
               </w:rPr>
-              <w:instrText xml:space="preserve"> PAGEREF _Toc244293424 \h </w:instrText>
+              <w:instrText xml:space="preserve"> PAGEREF _Toc244295220 \h </w:instrText>
             </w:r>
             <w:r>
               <w:rPr>
@@ -2147,7 +2138,7 @@
               <w:lang w:eastAsia="es-GT"/>
             </w:rPr>
           </w:pPr>
-          <w:hyperlink w:anchor="_Toc244293425" w:history="1">
+          <w:hyperlink w:anchor="_Toc244295221" w:history="1">
             <w:r>
               <w:rPr>
                 <w:rStyle w:val="Hipervnculo"/>
@@ -2175,7 +2166,7 @@
                 <w:noProof/>
                 <w:webHidden/>
               </w:rPr>
-              <w:instrText xml:space="preserve"> PAGEREF _Toc244293425 \h </w:instrText>
+              <w:instrText xml:space="preserve"> PAGEREF _Toc244295221 \h </w:instrText>
             </w:r>
             <w:r>
               <w:rPr>
@@ -2218,7 +2209,7 @@
               <w:lang w:eastAsia="es-GT"/>
             </w:rPr>
           </w:pPr>
-          <w:hyperlink w:anchor="_Toc244293426" w:history="1">
+          <w:hyperlink w:anchor="_Toc244295222" w:history="1">
             <w:r>
               <w:rPr>
                 <w:rStyle w:val="Hipervnculo"/>
@@ -2246,7 +2237,7 @@
                 <w:noProof/>
                 <w:webHidden/>
               </w:rPr>
-              <w:instrText xml:space="preserve"> PAGEREF _Toc244293426 \h </w:instrText>
+              <w:instrText xml:space="preserve"> PAGEREF _Toc244295222 \h </w:instrText>
             </w:r>
             <w:r>
               <w:rPr>
@@ -2289,7 +2280,7 @@
               <w:lang w:eastAsia="es-GT"/>
             </w:rPr>
           </w:pPr>
-          <w:hyperlink w:anchor="_Toc244293427" w:history="1">
+          <w:hyperlink w:anchor="_Toc244295223" w:history="1">
             <w:r>
               <w:rPr>
                 <w:rStyle w:val="Hipervnculo"/>
@@ -2317,7 +2308,7 @@
                 <w:noProof/>
                 <w:webHidden/>
               </w:rPr>
-              <w:instrText xml:space="preserve"> PAGEREF _Toc244293427 \h </w:instrText>
+              <w:instrText xml:space="preserve"> PAGEREF _Toc244295223 \h </w:instrText>
             </w:r>
             <w:r>
               <w:rPr>
@@ -2364,7 +2355,7 @@
               <w:lang w:eastAsia="es-GT"/>
             </w:rPr>
           </w:pPr>
-          <w:hyperlink w:anchor="_Toc244293428" w:history="1">
+          <w:hyperlink w:anchor="_Toc244295224" w:history="1">
             <w:r>
               <w:rPr>
                 <w:rStyle w:val="Hipervnculo"/>
@@ -2393,7 +2384,7 @@
                 <w:noProof/>
                 <w:webHidden/>
               </w:rPr>
-              <w:instrText xml:space="preserve"> PAGEREF _Toc244293428 \h </w:instrText>
+              <w:instrText xml:space="preserve"> PAGEREF _Toc244295224 \h </w:instrText>
             </w:r>
             <w:r>
               <w:rPr>
@@ -2508,7 +2499,7 @@
           <w:lang w:eastAsia="es-MX"/>
         </w:rPr>
       </w:pPr>
-      <w:bookmarkStart w:id="0" w:name="_Toc244293408"/>
+      <w:bookmarkStart w:id="0" w:name="_Toc244295204"/>
       <w:r>
         <w:rPr>
           <w:rFonts w:eastAsia="Times New Roman"/>
@@ -2684,7 +2675,7 @@
           <w:lang w:eastAsia="es-MX"/>
         </w:rPr>
       </w:pPr>
-      <w:bookmarkStart w:id="1" w:name="_Toc244293409"/>
+      <w:bookmarkStart w:id="1" w:name="_Toc244295205"/>
       <w:r>
         <w:rPr>
           <w:lang w:eastAsia="es-MX"/>
@@ -2701,7 +2692,7 @@
           <w:lang w:eastAsia="es-MX"/>
         </w:rPr>
       </w:pPr>
-      <w:bookmarkStart w:id="2" w:name="_Toc244293410"/>
+      <w:bookmarkStart w:id="2" w:name="_Toc244295206"/>
       <w:r>
         <w:rPr>
           <w:lang w:eastAsia="es-MX"/>
@@ -2876,7 +2867,7 @@
           <w:lang w:eastAsia="es-MX"/>
         </w:rPr>
       </w:pPr>
-      <w:bookmarkStart w:id="3" w:name="_Toc244293411"/>
+      <w:bookmarkStart w:id="3" w:name="_Toc244295207"/>
       <w:r>
         <w:rPr>
           <w:lang w:eastAsia="es-MX"/>
@@ -2892,7 +2883,7 @@
           <w:lang w:eastAsia="es-MX"/>
         </w:rPr>
       </w:pPr>
-      <w:bookmarkStart w:id="4" w:name="_Toc244293412"/>
+      <w:bookmarkStart w:id="4" w:name="_Toc244295208"/>
       <w:r>
         <w:rPr>
           <w:lang w:eastAsia="es-MX"/>
@@ -3065,7 +3056,7 @@
           <w:lang w:eastAsia="es-MX"/>
         </w:rPr>
       </w:pPr>
-      <w:bookmarkStart w:id="5" w:name="_Toc244293413"/>
+      <w:bookmarkStart w:id="5" w:name="_Toc244295209"/>
       <w:r>
         <w:rPr>
           <w:lang w:eastAsia="es-MX"/>
@@ -3089,21 +3080,7 @@
         <w:rPr>
           <w:lang w:eastAsia="es-MX"/>
         </w:rPr>
-        <w:t xml:space="preserve">Aplicación móvil: Android con </w:t>
-      </w:r>
-      <w:proofErr w:type="spellStart"/>
-      <w:r>
-        <w:rPr>
-          <w:lang w:eastAsia="es-MX"/>
-        </w:rPr>
-        <w:t>Kotlin</w:t>
-      </w:r>
-      <w:proofErr w:type="spellEnd"/>
-      <w:r>
-        <w:rPr>
-          <w:lang w:eastAsia="es-MX"/>
-        </w:rPr>
-        <w:t>.</w:t>
+        <w:t>Aplicación móvil: Android con Kotlin.</w:t>
       </w:r>
     </w:p>
     <w:p>
@@ -3149,7 +3126,7 @@
           <w:lang w:eastAsia="es-MX"/>
         </w:rPr>
       </w:pPr>
-      <w:bookmarkStart w:id="6" w:name="_Toc244293414"/>
+      <w:bookmarkStart w:id="6" w:name="_Toc244295210"/>
       <w:r>
         <w:rPr>
           <w:lang w:eastAsia="es-MX"/>
@@ -3207,7 +3184,7 @@
           <w:lang w:eastAsia="es-MX"/>
         </w:rPr>
       </w:pPr>
-      <w:bookmarkStart w:id="7" w:name="_Toc244293415"/>
+      <w:bookmarkStart w:id="7" w:name="_Toc244295211"/>
       <w:r>
         <w:rPr>
           <w:lang w:eastAsia="es-MX"/>
@@ -3226,49 +3203,7 @@
         <w:rPr>
           <w:lang w:eastAsia="es-MX"/>
         </w:rPr>
-        <w:t xml:space="preserve">La base de datos tiene 8 entidades. Cuatro son catálogos (Empleado, </w:t>
-      </w:r>
-      <w:proofErr w:type="spellStart"/>
-      <w:r>
-        <w:rPr>
-          <w:lang w:eastAsia="es-MX"/>
-        </w:rPr>
-        <w:t>TipoIncidencia</w:t>
-      </w:r>
-      <w:proofErr w:type="spellEnd"/>
-      <w:r>
-        <w:rPr>
-          <w:lang w:eastAsia="es-MX"/>
-        </w:rPr>
-        <w:t xml:space="preserve">, Prioridad y </w:t>
-      </w:r>
-      <w:proofErr w:type="spellStart"/>
-      <w:r>
-        <w:rPr>
-          <w:lang w:eastAsia="es-MX"/>
-        </w:rPr>
-        <w:t>EstadoIncidencia</w:t>
-      </w:r>
-      <w:proofErr w:type="spellEnd"/>
-      <w:r>
-        <w:rPr>
-          <w:lang w:eastAsia="es-MX"/>
-        </w:rPr>
-        <w:t xml:space="preserve">), una es la tabla principal (Incidencia) y tres dependen de ella (Asignación, Fotografía e </w:t>
-      </w:r>
-      <w:proofErr w:type="spellStart"/>
-      <w:r>
-        <w:rPr>
-          <w:lang w:eastAsia="es-MX"/>
-        </w:rPr>
-        <w:t>HistorialIncidencia</w:t>
-      </w:r>
-      <w:proofErr w:type="spellEnd"/>
-      <w:r>
-        <w:rPr>
-          <w:lang w:eastAsia="es-MX"/>
-        </w:rPr>
-        <w:t>).</w:t>
+        <w:t>La base de datos tiene 8 entidades. Cuatro son catálogos (Empleado, TipoIncidencia, Prioridad y EstadoIncidencia), una es la tabla principal (Incidencia) y tres dependen de ella (Asignación, Fotografía e HistorialIncidencia).</w:t>
       </w:r>
     </w:p>
     <w:p>
@@ -3419,7 +3354,7 @@
           <w:lang w:eastAsia="es-MX"/>
         </w:rPr>
       </w:pPr>
-      <w:bookmarkStart w:id="8" w:name="_Toc244293416"/>
+      <w:bookmarkStart w:id="8" w:name="_Toc244295212"/>
       <w:r>
         <w:rPr>
           <w:lang w:eastAsia="es-MX"/>
@@ -3517,19 +3452,11 @@
                 <w:lang w:eastAsia="es-MX"/>
               </w:rPr>
             </w:pPr>
-            <w:proofErr w:type="spellStart"/>
-            <w:r>
-              <w:rPr>
-                <w:lang w:eastAsia="es-MX"/>
-              </w:rPr>
-              <w:t>TipoIncidencia</w:t>
-            </w:r>
-            <w:proofErr w:type="spellEnd"/>
-            <w:r>
-              <w:rPr>
-                <w:lang w:eastAsia="es-MX"/>
-              </w:rPr>
-              <w:t xml:space="preserve"> </w:t>
+            <w:r>
+              <w:rPr>
+                <w:lang w:eastAsia="es-MX"/>
+              </w:rPr>
+              <w:t xml:space="preserve">TipoIncidencia </w:t>
             </w:r>
             <w:r>
               <w:rPr>
@@ -3670,19 +3597,11 @@
                 <w:lang w:eastAsia="es-MX"/>
               </w:rPr>
             </w:pPr>
-            <w:proofErr w:type="spellStart"/>
-            <w:r>
-              <w:rPr>
-                <w:lang w:eastAsia="es-MX"/>
-              </w:rPr>
-              <w:t>EstadoIncidencia</w:t>
-            </w:r>
-            <w:proofErr w:type="spellEnd"/>
-            <w:r>
-              <w:rPr>
-                <w:lang w:eastAsia="es-MX"/>
-              </w:rPr>
-              <w:t xml:space="preserve"> </w:t>
+            <w:r>
+              <w:rPr>
+                <w:lang w:eastAsia="es-MX"/>
+              </w:rPr>
+              <w:t xml:space="preserve">EstadoIncidencia </w:t>
             </w:r>
             <w:r>
               <w:rPr>
@@ -3839,14 +3758,7 @@
               <w:rPr>
                 <w:lang w:eastAsia="es-MX"/>
               </w:rPr>
-              <w:t xml:space="preserve"> </w:t>
-            </w:r>
-            <w:proofErr w:type="spellStart"/>
-            <w:r>
-              <w:rPr>
-                <w:lang w:eastAsia="es-MX"/>
-              </w:rPr>
-              <w:t>Asignaci</w:t>
+              <w:t xml:space="preserve"> Asignaci</w:t>
             </w:r>
             <w:r>
               <w:rPr>
@@ -3860,7 +3772,6 @@
               </w:rPr>
               <w:t>n</w:t>
             </w:r>
-            <w:proofErr w:type="spellEnd"/>
           </w:p>
         </w:tc>
         <w:tc>
@@ -3948,14 +3859,7 @@
               <w:rPr>
                 <w:lang w:eastAsia="es-MX"/>
               </w:rPr>
-              <w:t xml:space="preserve"> </w:t>
-            </w:r>
-            <w:proofErr w:type="spellStart"/>
-            <w:r>
-              <w:rPr>
-                <w:lang w:eastAsia="es-MX"/>
-              </w:rPr>
-              <w:t>Asignaci</w:t>
+              <w:t xml:space="preserve"> Asignaci</w:t>
             </w:r>
             <w:r>
               <w:rPr>
@@ -3969,7 +3873,6 @@
               </w:rPr>
               <w:t>n</w:t>
             </w:r>
-            <w:proofErr w:type="spellEnd"/>
           </w:p>
         </w:tc>
         <w:tc>
@@ -4048,14 +3951,7 @@
               <w:rPr>
                 <w:lang w:eastAsia="es-MX"/>
               </w:rPr>
-              <w:t xml:space="preserve"> </w:t>
-            </w:r>
-            <w:proofErr w:type="spellStart"/>
-            <w:r>
-              <w:rPr>
-                <w:lang w:eastAsia="es-MX"/>
-              </w:rPr>
-              <w:t>Fotograf</w:t>
+              <w:t xml:space="preserve"> Fotograf</w:t>
             </w:r>
             <w:r>
               <w:rPr>
@@ -4069,7 +3965,6 @@
               </w:rPr>
               <w:t>a</w:t>
             </w:r>
-            <w:proofErr w:type="spellEnd"/>
           </w:p>
         </w:tc>
         <w:tc>
@@ -4139,16 +4034,8 @@
               <w:rPr>
                 <w:lang w:eastAsia="es-MX"/>
               </w:rPr>
-              <w:t xml:space="preserve"> </w:t>
-            </w:r>
-            <w:proofErr w:type="spellStart"/>
-            <w:r>
-              <w:rPr>
-                <w:lang w:eastAsia="es-MX"/>
-              </w:rPr>
-              <w:t>HistorialIncidencia</w:t>
-            </w:r>
-            <w:proofErr w:type="spellEnd"/>
+              <w:t xml:space="preserve"> HistorialIncidencia</w:t>
+            </w:r>
           </w:p>
         </w:tc>
         <w:tc>
@@ -4205,19 +4092,11 @@
                 <w:lang w:eastAsia="es-MX"/>
               </w:rPr>
             </w:pPr>
-            <w:proofErr w:type="spellStart"/>
-            <w:r>
-              <w:rPr>
-                <w:lang w:eastAsia="es-MX"/>
-              </w:rPr>
-              <w:t>EstadoIncidencia</w:t>
-            </w:r>
-            <w:proofErr w:type="spellEnd"/>
-            <w:r>
-              <w:rPr>
-                <w:lang w:eastAsia="es-MX"/>
-              </w:rPr>
-              <w:t xml:space="preserve"> </w:t>
+            <w:r>
+              <w:rPr>
+                <w:lang w:eastAsia="es-MX"/>
+              </w:rPr>
+              <w:t xml:space="preserve">EstadoIncidencia </w:t>
             </w:r>
             <w:r>
               <w:rPr>
@@ -4229,16 +4108,8 @@
               <w:rPr>
                 <w:lang w:eastAsia="es-MX"/>
               </w:rPr>
-              <w:t xml:space="preserve"> </w:t>
-            </w:r>
-            <w:proofErr w:type="spellStart"/>
-            <w:r>
-              <w:rPr>
-                <w:lang w:eastAsia="es-MX"/>
-              </w:rPr>
-              <w:t>HistorialIncidencia</w:t>
-            </w:r>
-            <w:proofErr w:type="spellEnd"/>
+              <w:t xml:space="preserve"> HistorialIncidencia</w:t>
+            </w:r>
           </w:p>
         </w:tc>
         <w:tc>
@@ -4308,16 +4179,8 @@
               <w:rPr>
                 <w:lang w:eastAsia="es-MX"/>
               </w:rPr>
-              <w:t xml:space="preserve"> </w:t>
-            </w:r>
-            <w:proofErr w:type="spellStart"/>
-            <w:r>
-              <w:rPr>
-                <w:lang w:eastAsia="es-MX"/>
-              </w:rPr>
-              <w:t>HistorialIncidencia</w:t>
-            </w:r>
-            <w:proofErr w:type="spellEnd"/>
+              <w:t xml:space="preserve"> HistorialIncidencia</w:t>
+            </w:r>
           </w:p>
         </w:tc>
         <w:tc>
@@ -4391,7 +4254,7 @@
           <w:lang w:eastAsia="es-MX"/>
         </w:rPr>
       </w:pPr>
-      <w:bookmarkStart w:id="9" w:name="_Toc244293417"/>
+      <w:bookmarkStart w:id="9" w:name="_Toc244295213"/>
       <w:r>
         <w:rPr>
           <w:lang w:eastAsia="es-MX"/>
@@ -4408,7 +4271,7 @@
           <w:lang w:eastAsia="es-MX"/>
         </w:rPr>
       </w:pPr>
-      <w:bookmarkStart w:id="10" w:name="_Toc244293418"/>
+      <w:bookmarkStart w:id="10" w:name="_Toc244295214"/>
       <w:r>
         <w:rPr>
           <w:lang w:eastAsia="es-MX"/>
@@ -4449,13 +4312,8 @@
           <w:numId w:val="3"/>
         </w:numPr>
       </w:pPr>
-      <w:proofErr w:type="spellStart"/>
-      <w:r>
-        <w:t>identity</w:t>
-      </w:r>
-      <w:proofErr w:type="spellEnd"/>
-      <w:r>
-        <w:t>: el número lo genera SQL Server solo, empieza en 1 y sube de 1 en 1.</w:t>
+      <w:r>
+        <w:t>identity: el número lo genera SQL Server solo, empieza en 1 y sube de 1 en 1.</w:t>
       </w:r>
     </w:p>
     <w:p>
@@ -4531,7 +4389,7 @@
           <w:lang w:eastAsia="es-MX"/>
         </w:rPr>
       </w:pPr>
-      <w:bookmarkStart w:id="11" w:name="_Toc244293419"/>
+      <w:bookmarkStart w:id="11" w:name="_Toc244295215"/>
       <w:r>
         <w:rPr>
           <w:lang w:eastAsia="es-MX"/>
@@ -4673,14 +4531,12 @@
                 <w:lang w:eastAsia="es-MX"/>
               </w:rPr>
             </w:pPr>
-            <w:proofErr w:type="spellStart"/>
             <w:r>
               <w:rPr>
                 <w:lang w:eastAsia="es-MX"/>
               </w:rPr>
               <w:t>EmpleadoId</w:t>
             </w:r>
-            <w:proofErr w:type="spellEnd"/>
           </w:p>
         </w:tc>
         <w:tc>
@@ -4717,16 +4573,8 @@
               <w:rPr>
                 <w:lang w:eastAsia="es-MX"/>
               </w:rPr>
-              <w:t xml:space="preserve">PK, </w:t>
-            </w:r>
-            <w:proofErr w:type="spellStart"/>
-            <w:r>
-              <w:rPr>
-                <w:lang w:eastAsia="es-MX"/>
-              </w:rPr>
-              <w:t>identity</w:t>
-            </w:r>
-            <w:proofErr w:type="spellEnd"/>
+              <w:t>PK, identity</w:t>
+            </w:r>
           </w:p>
         </w:tc>
         <w:tc>
@@ -4761,14 +4609,12 @@
                 <w:lang w:eastAsia="es-MX"/>
               </w:rPr>
             </w:pPr>
-            <w:proofErr w:type="spellStart"/>
             <w:r>
               <w:rPr>
                 <w:lang w:eastAsia="es-MX"/>
               </w:rPr>
               <w:t>NumeroEmpleado</w:t>
             </w:r>
-            <w:proofErr w:type="spellEnd"/>
           </w:p>
         </w:tc>
         <w:tc>
@@ -5221,8 +5067,7 @@
           <w:lang w:eastAsia="es-MX"/>
         </w:rPr>
       </w:pPr>
-      <w:bookmarkStart w:id="12" w:name="_Toc244293420"/>
-      <w:proofErr w:type="spellStart"/>
+      <w:bookmarkStart w:id="12" w:name="_Toc244295216"/>
       <w:r>
         <w:rPr>
           <w:lang w:eastAsia="es-MX"/>
@@ -5231,7 +5076,6 @@
         <w:t>TipoIncidencia</w:t>
       </w:r>
       <w:bookmarkEnd w:id="12"/>
-      <w:proofErr w:type="spellEnd"/>
     </w:p>
     <w:p>
       <w:pPr>
@@ -5360,7 +5204,6 @@
                 <w:lang w:eastAsia="es-MX"/>
               </w:rPr>
             </w:pPr>
-            <w:proofErr w:type="spellStart"/>
             <w:r>
               <w:rPr>
                 <w:lang w:eastAsia="es-MX"/>
@@ -5379,7 +5222,6 @@
               </w:rPr>
               <w:t>d</w:t>
             </w:r>
-            <w:proofErr w:type="spellEnd"/>
           </w:p>
         </w:tc>
         <w:tc>
@@ -5416,16 +5258,8 @@
               <w:rPr>
                 <w:lang w:eastAsia="es-MX"/>
               </w:rPr>
-              <w:t xml:space="preserve">PK, </w:t>
-            </w:r>
-            <w:proofErr w:type="spellStart"/>
-            <w:r>
-              <w:rPr>
-                <w:lang w:eastAsia="es-MX"/>
-              </w:rPr>
-              <w:t>identity</w:t>
-            </w:r>
-            <w:proofErr w:type="spellEnd"/>
+              <w:t>PK, identity</w:t>
+            </w:r>
           </w:p>
         </w:tc>
         <w:tc>
@@ -5729,7 +5563,7 @@
           <w:lang w:eastAsia="es-MX"/>
         </w:rPr>
       </w:pPr>
-      <w:bookmarkStart w:id="13" w:name="_Toc244293421"/>
+      <w:bookmarkStart w:id="13" w:name="_Toc244295217"/>
       <w:r>
         <w:rPr>
           <w:lang w:eastAsia="es-MX"/>
@@ -5877,7 +5711,6 @@
                 <w:lang w:eastAsia="es-MX"/>
               </w:rPr>
             </w:pPr>
-            <w:proofErr w:type="spellStart"/>
             <w:r>
               <w:rPr>
                 <w:lang w:eastAsia="es-MX"/>
@@ -5896,7 +5729,6 @@
               </w:rPr>
               <w:t>d</w:t>
             </w:r>
-            <w:proofErr w:type="spellEnd"/>
           </w:p>
         </w:tc>
         <w:tc>
@@ -5933,16 +5765,8 @@
               <w:rPr>
                 <w:lang w:eastAsia="es-MX"/>
               </w:rPr>
-              <w:t xml:space="preserve">PK, </w:t>
-            </w:r>
-            <w:proofErr w:type="spellStart"/>
-            <w:r>
-              <w:rPr>
-                <w:lang w:eastAsia="es-MX"/>
-              </w:rPr>
-              <w:t>identity</w:t>
-            </w:r>
-            <w:proofErr w:type="spellEnd"/>
+              <w:t>PK, identity</w:t>
+            </w:r>
           </w:p>
         </w:tc>
         <w:tc>
@@ -6393,8 +6217,7 @@
           <w:lang w:eastAsia="es-MX"/>
         </w:rPr>
       </w:pPr>
-      <w:bookmarkStart w:id="14" w:name="_Toc244293422"/>
-      <w:proofErr w:type="spellStart"/>
+      <w:bookmarkStart w:id="14" w:name="_Toc244295218"/>
       <w:r>
         <w:rPr>
           <w:lang w:eastAsia="es-MX"/>
@@ -6403,7 +6226,6 @@
         <w:t>EstadoIncidencia</w:t>
       </w:r>
       <w:bookmarkEnd w:id="14"/>
-      <w:proofErr w:type="spellEnd"/>
     </w:p>
     <w:p>
       <w:pPr>
@@ -6532,14 +6354,12 @@
                 <w:lang w:eastAsia="es-MX"/>
               </w:rPr>
             </w:pPr>
-            <w:proofErr w:type="spellStart"/>
             <w:r>
               <w:rPr>
                 <w:lang w:eastAsia="es-MX"/>
               </w:rPr>
               <w:t>EstadoId</w:t>
             </w:r>
-            <w:proofErr w:type="spellEnd"/>
           </w:p>
         </w:tc>
         <w:tc>
@@ -6576,16 +6396,8 @@
               <w:rPr>
                 <w:lang w:eastAsia="es-MX"/>
               </w:rPr>
-              <w:t xml:space="preserve">PK, </w:t>
-            </w:r>
-            <w:proofErr w:type="spellStart"/>
-            <w:r>
-              <w:rPr>
-                <w:lang w:eastAsia="es-MX"/>
-              </w:rPr>
-              <w:t>identity</w:t>
-            </w:r>
-            <w:proofErr w:type="spellEnd"/>
+              <w:t>PK, identity</w:t>
+            </w:r>
           </w:p>
         </w:tc>
         <w:tc>
@@ -6982,7 +6794,7 @@
           <w:lang w:eastAsia="es-MX"/>
         </w:rPr>
       </w:pPr>
-      <w:bookmarkStart w:id="15" w:name="_Toc244293423"/>
+      <w:bookmarkStart w:id="15" w:name="_Toc244295219"/>
       <w:r>
         <w:rPr>
           <w:lang w:eastAsia="es-MX"/>
@@ -7112,14 +6924,12 @@
                 <w:lang w:eastAsia="es-MX"/>
               </w:rPr>
             </w:pPr>
-            <w:proofErr w:type="spellStart"/>
             <w:r>
               <w:rPr>
                 <w:lang w:eastAsia="es-MX"/>
               </w:rPr>
               <w:t>IncidenciaId</w:t>
             </w:r>
-            <w:proofErr w:type="spellEnd"/>
           </w:p>
         </w:tc>
         <w:tc>
@@ -7156,16 +6966,8 @@
               <w:rPr>
                 <w:lang w:eastAsia="es-MX"/>
               </w:rPr>
-              <w:t xml:space="preserve">PK, </w:t>
-            </w:r>
-            <w:proofErr w:type="spellStart"/>
-            <w:r>
-              <w:rPr>
-                <w:lang w:eastAsia="es-MX"/>
-              </w:rPr>
-              <w:t>identity</w:t>
-            </w:r>
-            <w:proofErr w:type="spellEnd"/>
+              <w:t>PK, identity</w:t>
+            </w:r>
           </w:p>
         </w:tc>
         <w:tc>
@@ -7342,30 +7144,8 @@
               <w:rPr>
                 <w:lang w:val="en-US" w:eastAsia="es-MX"/>
               </w:rPr>
-              <w:t xml:space="preserve">, CHECK </w:t>
-            </w:r>
-            <w:proofErr w:type="spellStart"/>
-            <w:r>
-              <w:rPr>
-                <w:lang w:val="en-US" w:eastAsia="es-MX"/>
-              </w:rPr>
-              <w:t>mínimo</w:t>
-            </w:r>
-            <w:proofErr w:type="spellEnd"/>
-            <w:r>
-              <w:rPr>
-                <w:lang w:val="en-US" w:eastAsia="es-MX"/>
-              </w:rPr>
-              <w:t xml:space="preserve"> 5 </w:t>
-            </w:r>
-            <w:proofErr w:type="spellStart"/>
-            <w:r>
-              <w:rPr>
-                <w:lang w:val="en-US" w:eastAsia="es-MX"/>
-              </w:rPr>
-              <w:t>caracteres</w:t>
-            </w:r>
-            <w:proofErr w:type="spellEnd"/>
+              <w:t>, CHECK mínimo 5 caracteres</w:t>
+            </w:r>
           </w:p>
         </w:tc>
         <w:tc>
@@ -7400,14 +7180,12 @@
                 <w:lang w:eastAsia="es-MX"/>
               </w:rPr>
             </w:pPr>
-            <w:proofErr w:type="spellStart"/>
             <w:r>
               <w:rPr>
                 <w:lang w:eastAsia="es-MX"/>
               </w:rPr>
               <w:t>Descripcion</w:t>
             </w:r>
-            <w:proofErr w:type="spellEnd"/>
           </w:p>
         </w:tc>
         <w:tc>
@@ -7483,14 +7261,12 @@
                 <w:lang w:eastAsia="es-MX"/>
               </w:rPr>
             </w:pPr>
-            <w:proofErr w:type="spellStart"/>
             <w:r>
               <w:rPr>
                 <w:lang w:eastAsia="es-MX"/>
               </w:rPr>
               <w:t>TipoId</w:t>
             </w:r>
-            <w:proofErr w:type="spellEnd"/>
           </w:p>
         </w:tc>
         <w:tc>
@@ -7533,16 +7309,8 @@
               <w:rPr>
                 <w:lang w:val="en-US" w:eastAsia="es-MX"/>
               </w:rPr>
-              <w:t xml:space="preserve">, FK a </w:t>
-            </w:r>
-            <w:proofErr w:type="spellStart"/>
-            <w:r>
-              <w:rPr>
-                <w:lang w:val="en-US" w:eastAsia="es-MX"/>
-              </w:rPr>
-              <w:t>TipoIncidencia</w:t>
-            </w:r>
-            <w:proofErr w:type="spellEnd"/>
+              <w:t>, FK a TipoIncidencia</w:t>
+            </w:r>
           </w:p>
         </w:tc>
         <w:tc>
@@ -7577,14 +7345,12 @@
                 <w:lang w:eastAsia="es-MX"/>
               </w:rPr>
             </w:pPr>
-            <w:proofErr w:type="spellStart"/>
             <w:r>
               <w:rPr>
                 <w:lang w:eastAsia="es-MX"/>
               </w:rPr>
               <w:t>PrioridadId</w:t>
             </w:r>
-            <w:proofErr w:type="spellEnd"/>
           </w:p>
         </w:tc>
         <w:tc>
@@ -7627,16 +7393,8 @@
               <w:rPr>
                 <w:lang w:val="en-US" w:eastAsia="es-MX"/>
               </w:rPr>
-              <w:t xml:space="preserve">, FK a </w:t>
-            </w:r>
-            <w:proofErr w:type="spellStart"/>
-            <w:r>
-              <w:rPr>
-                <w:lang w:val="en-US" w:eastAsia="es-MX"/>
-              </w:rPr>
-              <w:t>Prioridad</w:t>
-            </w:r>
-            <w:proofErr w:type="spellEnd"/>
+              <w:t>, FK a Prioridad</w:t>
+            </w:r>
           </w:p>
         </w:tc>
         <w:tc>
@@ -7674,14 +7432,12 @@
                 <w:lang w:eastAsia="es-MX"/>
               </w:rPr>
             </w:pPr>
-            <w:proofErr w:type="spellStart"/>
             <w:r>
               <w:rPr>
                 <w:lang w:eastAsia="es-MX"/>
               </w:rPr>
               <w:t>EstadoId</w:t>
             </w:r>
-            <w:proofErr w:type="spellEnd"/>
           </w:p>
         </w:tc>
         <w:tc>
@@ -7724,16 +7480,8 @@
               <w:rPr>
                 <w:lang w:eastAsia="es-MX"/>
               </w:rPr>
-              <w:t xml:space="preserve">, FK a </w:t>
-            </w:r>
-            <w:proofErr w:type="spellStart"/>
-            <w:r>
-              <w:rPr>
-                <w:lang w:eastAsia="es-MX"/>
-              </w:rPr>
-              <w:t>EstadoIncidencia</w:t>
-            </w:r>
-            <w:proofErr w:type="spellEnd"/>
+              <w:t>, FK a EstadoIncidencia</w:t>
+            </w:r>
           </w:p>
         </w:tc>
         <w:tc>
@@ -7768,14 +7516,12 @@
                 <w:lang w:eastAsia="es-MX"/>
               </w:rPr>
             </w:pPr>
-            <w:proofErr w:type="spellStart"/>
             <w:r>
               <w:rPr>
                 <w:lang w:eastAsia="es-MX"/>
               </w:rPr>
               <w:t>ReportaEmpleadoId</w:t>
             </w:r>
-            <w:proofErr w:type="spellEnd"/>
           </w:p>
         </w:tc>
         <w:tc>
@@ -7818,16 +7564,8 @@
               <w:rPr>
                 <w:lang w:val="en-US" w:eastAsia="es-MX"/>
               </w:rPr>
-              <w:t xml:space="preserve">, FK a </w:t>
-            </w:r>
-            <w:proofErr w:type="spellStart"/>
-            <w:r>
-              <w:rPr>
-                <w:lang w:val="en-US" w:eastAsia="es-MX"/>
-              </w:rPr>
-              <w:t>Empleado</w:t>
-            </w:r>
-            <w:proofErr w:type="spellEnd"/>
+              <w:t>, FK a Empleado</w:t>
+            </w:r>
           </w:p>
         </w:tc>
         <w:tc>
@@ -7877,14 +7615,12 @@
                 <w:lang w:eastAsia="es-MX"/>
               </w:rPr>
             </w:pPr>
-            <w:proofErr w:type="spellStart"/>
             <w:r>
               <w:rPr>
                 <w:lang w:eastAsia="es-MX"/>
               </w:rPr>
               <w:t>FechaRegistro</w:t>
             </w:r>
-            <w:proofErr w:type="spellEnd"/>
           </w:p>
         </w:tc>
         <w:tc>
@@ -7927,21 +7663,7 @@
               <w:rPr>
                 <w:lang w:val="en-US" w:eastAsia="es-MX"/>
               </w:rPr>
-              <w:t xml:space="preserve">, default </w:t>
-            </w:r>
-            <w:proofErr w:type="spellStart"/>
-            <w:r>
-              <w:rPr>
-                <w:lang w:val="en-US" w:eastAsia="es-MX"/>
-              </w:rPr>
-              <w:t>fecha</w:t>
-            </w:r>
-            <w:proofErr w:type="spellEnd"/>
-            <w:r>
-              <w:rPr>
-                <w:lang w:val="en-US" w:eastAsia="es-MX"/>
-              </w:rPr>
-              <w:t xml:space="preserve"> actual</w:t>
+              <w:t>, default fecha actual</w:t>
             </w:r>
           </w:p>
         </w:tc>
@@ -7983,14 +7705,12 @@
                 <w:lang w:eastAsia="es-MX"/>
               </w:rPr>
             </w:pPr>
-            <w:proofErr w:type="spellStart"/>
             <w:r>
               <w:rPr>
                 <w:lang w:eastAsia="es-MX"/>
               </w:rPr>
               <w:t>Solucion</w:t>
             </w:r>
-            <w:proofErr w:type="spellEnd"/>
           </w:p>
         </w:tc>
         <w:tc>
@@ -8066,14 +7786,12 @@
                 <w:lang w:eastAsia="es-MX"/>
               </w:rPr>
             </w:pPr>
-            <w:proofErr w:type="spellStart"/>
             <w:r>
               <w:rPr>
                 <w:lang w:eastAsia="es-MX"/>
               </w:rPr>
               <w:t>FechaResolucion</w:t>
             </w:r>
-            <w:proofErr w:type="spellEnd"/>
           </w:p>
         </w:tc>
         <w:tc>
@@ -8232,8 +7950,7 @@
           <w:lang w:eastAsia="es-MX"/>
         </w:rPr>
       </w:pPr>
-      <w:bookmarkStart w:id="16" w:name="_Toc244293424"/>
-      <w:proofErr w:type="spellStart"/>
+      <w:bookmarkStart w:id="16" w:name="_Toc244295220"/>
       <w:r>
         <w:rPr>
           <w:lang w:eastAsia="es-MX"/>
@@ -8242,7 +7959,6 @@
         <w:t>Asignacion</w:t>
       </w:r>
       <w:bookmarkEnd w:id="16"/>
-      <w:proofErr w:type="spellEnd"/>
     </w:p>
     <w:p>
       <w:pPr>
@@ -8348,11 +8064,9 @@
             <w:tcW w:w="2340" w:type="dxa"/>
           </w:tcPr>
           <w:p>
-            <w:proofErr w:type="spellStart"/>
             <w:r>
               <w:t>AsignacionId</w:t>
             </w:r>
-            <w:proofErr w:type="spellEnd"/>
           </w:p>
         </w:tc>
         <w:tc>
@@ -8371,13 +8085,8 @@
           </w:tcPr>
           <w:p>
             <w:r>
-              <w:t xml:space="preserve">PK, </w:t>
-            </w:r>
-            <w:proofErr w:type="spellStart"/>
-            <w:r>
-              <w:t>identity</w:t>
-            </w:r>
-            <w:proofErr w:type="spellEnd"/>
+              <w:t>PK, identity</w:t>
+            </w:r>
           </w:p>
         </w:tc>
         <w:tc>
@@ -8397,11 +8106,9 @@
             <w:tcW w:w="2340" w:type="dxa"/>
           </w:tcPr>
           <w:p>
-            <w:proofErr w:type="spellStart"/>
             <w:r>
               <w:t>IncidenciaId</w:t>
             </w:r>
-            <w:proofErr w:type="spellEnd"/>
           </w:p>
         </w:tc>
         <w:tc>
@@ -8434,16 +8141,8 @@
               <w:rPr>
                 <w:lang w:val="en-US"/>
               </w:rPr>
-              <w:t xml:space="preserve">, FK a </w:t>
-            </w:r>
-            <w:proofErr w:type="spellStart"/>
-            <w:r>
-              <w:rPr>
-                <w:lang w:val="en-US"/>
-              </w:rPr>
-              <w:t>Incidencia</w:t>
-            </w:r>
-            <w:proofErr w:type="spellEnd"/>
+              <w:t>, FK a Incidencia</w:t>
+            </w:r>
           </w:p>
         </w:tc>
         <w:tc>
@@ -8466,11 +8165,9 @@
             <w:tcW w:w="2340" w:type="dxa"/>
           </w:tcPr>
           <w:p>
-            <w:proofErr w:type="spellStart"/>
             <w:r>
               <w:t>ResponsableEmpleadoId</w:t>
             </w:r>
-            <w:proofErr w:type="spellEnd"/>
           </w:p>
         </w:tc>
         <w:tc>
@@ -8503,16 +8200,8 @@
               <w:rPr>
                 <w:lang w:val="en-US"/>
               </w:rPr>
-              <w:t xml:space="preserve">, FK a </w:t>
-            </w:r>
-            <w:proofErr w:type="spellStart"/>
-            <w:r>
-              <w:rPr>
-                <w:lang w:val="en-US"/>
-              </w:rPr>
-              <w:t>Empleado</w:t>
-            </w:r>
-            <w:proofErr w:type="spellEnd"/>
+              <w:t>, FK a Empleado</w:t>
+            </w:r>
           </w:p>
         </w:tc>
         <w:tc>
@@ -8532,11 +8221,9 @@
             <w:tcW w:w="2340" w:type="dxa"/>
           </w:tcPr>
           <w:p>
-            <w:proofErr w:type="spellStart"/>
             <w:r>
               <w:t>AsignaEmpleadoId</w:t>
             </w:r>
-            <w:proofErr w:type="spellEnd"/>
           </w:p>
         </w:tc>
         <w:tc>
@@ -8569,16 +8256,8 @@
               <w:rPr>
                 <w:lang w:val="en-US"/>
               </w:rPr>
-              <w:t xml:space="preserve">, FK a </w:t>
-            </w:r>
-            <w:proofErr w:type="spellStart"/>
-            <w:r>
-              <w:rPr>
-                <w:lang w:val="en-US"/>
-              </w:rPr>
-              <w:t>Empleado</w:t>
-            </w:r>
-            <w:proofErr w:type="spellEnd"/>
+              <w:t>, FK a Empleado</w:t>
+            </w:r>
           </w:p>
         </w:tc>
         <w:tc>
@@ -8601,11 +8280,9 @@
             <w:tcW w:w="2340" w:type="dxa"/>
           </w:tcPr>
           <w:p>
-            <w:proofErr w:type="spellStart"/>
             <w:r>
               <w:t>FechaAsignacion</w:t>
             </w:r>
-            <w:proofErr w:type="spellEnd"/>
           </w:p>
         </w:tc>
         <w:tc>
@@ -8638,21 +8315,7 @@
               <w:rPr>
                 <w:lang w:val="en-US"/>
               </w:rPr>
-              <w:t xml:space="preserve">, default </w:t>
-            </w:r>
-            <w:proofErr w:type="spellStart"/>
-            <w:r>
-              <w:rPr>
-                <w:lang w:val="en-US"/>
-              </w:rPr>
-              <w:t>fecha</w:t>
-            </w:r>
-            <w:proofErr w:type="spellEnd"/>
-            <w:r>
-              <w:rPr>
-                <w:lang w:val="en-US"/>
-              </w:rPr>
-              <w:t xml:space="preserve"> actual</w:t>
+              <w:t>, default fecha actual</w:t>
             </w:r>
           </w:p>
         </w:tc>
@@ -8765,8 +8428,7 @@
           <w:lang w:eastAsia="es-MX"/>
         </w:rPr>
       </w:pPr>
-      <w:bookmarkStart w:id="17" w:name="_Toc244293425"/>
-      <w:proofErr w:type="spellStart"/>
+      <w:bookmarkStart w:id="17" w:name="_Toc244295221"/>
       <w:r>
         <w:rPr>
           <w:lang w:eastAsia="es-MX"/>
@@ -8774,7 +8436,6 @@
         <w:t>Fotografia</w:t>
       </w:r>
       <w:bookmarkEnd w:id="17"/>
-      <w:proofErr w:type="spellEnd"/>
     </w:p>
     <w:p>
       <w:pPr>
@@ -8856,11 +8517,9 @@
             <w:tcW w:w="2307" w:type="dxa"/>
           </w:tcPr>
           <w:p>
-            <w:proofErr w:type="spellStart"/>
             <w:r>
               <w:t>FotografiaId</w:t>
             </w:r>
-            <w:proofErr w:type="spellEnd"/>
           </w:p>
         </w:tc>
         <w:tc>
@@ -8879,13 +8538,8 @@
           </w:tcPr>
           <w:p>
             <w:r>
-              <w:t xml:space="preserve">PK, </w:t>
-            </w:r>
-            <w:proofErr w:type="spellStart"/>
-            <w:r>
-              <w:t>identity</w:t>
-            </w:r>
-            <w:proofErr w:type="spellEnd"/>
+              <w:t>PK, identity</w:t>
+            </w:r>
           </w:p>
         </w:tc>
         <w:tc>
@@ -8905,12 +8559,10 @@
             <w:tcW w:w="2307" w:type="dxa"/>
           </w:tcPr>
           <w:p>
-            <w:proofErr w:type="spellStart"/>
             <w:r>
               <w:lastRenderedPageBreak/>
               <w:t>IncidenciaId</w:t>
             </w:r>
-            <w:proofErr w:type="spellEnd"/>
           </w:p>
         </w:tc>
         <w:tc>
@@ -8943,16 +8595,8 @@
               <w:rPr>
                 <w:lang w:val="en-US"/>
               </w:rPr>
-              <w:t xml:space="preserve">, FK a </w:t>
-            </w:r>
-            <w:proofErr w:type="spellStart"/>
-            <w:r>
-              <w:rPr>
-                <w:lang w:val="en-US"/>
-              </w:rPr>
-              <w:t>Incidencia</w:t>
-            </w:r>
-            <w:proofErr w:type="spellEnd"/>
+              <w:t>, FK a Incidencia</w:t>
+            </w:r>
           </w:p>
         </w:tc>
         <w:tc>
@@ -8975,11 +8619,9 @@
             <w:tcW w:w="2307" w:type="dxa"/>
           </w:tcPr>
           <w:p>
-            <w:proofErr w:type="spellStart"/>
             <w:r>
               <w:t>TipoEvidencia</w:t>
             </w:r>
-            <w:proofErr w:type="spellEnd"/>
           </w:p>
         </w:tc>
         <w:tc>
@@ -9033,11 +8675,9 @@
             <w:tcW w:w="2307" w:type="dxa"/>
           </w:tcPr>
           <w:p>
-            <w:proofErr w:type="spellStart"/>
             <w:r>
               <w:t>UrlAlmacenamiento</w:t>
             </w:r>
-            <w:proofErr w:type="spellEnd"/>
           </w:p>
         </w:tc>
         <w:tc>
@@ -9080,11 +8720,9 @@
             <w:tcW w:w="2307" w:type="dxa"/>
           </w:tcPr>
           <w:p>
-            <w:proofErr w:type="spellStart"/>
             <w:r>
               <w:t>NombreArchivo</w:t>
             </w:r>
-            <w:proofErr w:type="spellEnd"/>
           </w:p>
         </w:tc>
         <w:tc>
@@ -9124,11 +8762,9 @@
             <w:tcW w:w="2307" w:type="dxa"/>
           </w:tcPr>
           <w:p>
-            <w:proofErr w:type="spellStart"/>
             <w:r>
               <w:t>FechaCaptura</w:t>
             </w:r>
-            <w:proofErr w:type="spellEnd"/>
           </w:p>
         </w:tc>
         <w:tc>
@@ -9161,21 +8797,7 @@
               <w:rPr>
                 <w:lang w:val="en-US"/>
               </w:rPr>
-              <w:t xml:space="preserve">, default </w:t>
-            </w:r>
-            <w:proofErr w:type="spellStart"/>
-            <w:r>
-              <w:rPr>
-                <w:lang w:val="en-US"/>
-              </w:rPr>
-              <w:t>fecha</w:t>
-            </w:r>
-            <w:proofErr w:type="spellEnd"/>
-            <w:r>
-              <w:rPr>
-                <w:lang w:val="en-US"/>
-              </w:rPr>
-              <w:t xml:space="preserve"> actual</w:t>
+              <w:t>, default fecha actual</w:t>
             </w:r>
           </w:p>
         </w:tc>
@@ -9207,8 +8829,7 @@
           <w:lang w:eastAsia="es-MX"/>
         </w:rPr>
       </w:pPr>
-      <w:bookmarkStart w:id="18" w:name="_Toc244293426"/>
-      <w:proofErr w:type="spellStart"/>
+      <w:bookmarkStart w:id="18" w:name="_Toc244295222"/>
       <w:r>
         <w:rPr>
           <w:lang w:eastAsia="es-MX"/>
@@ -9216,7 +8837,6 @@
         <w:t>HistorialIncidencia</w:t>
       </w:r>
       <w:bookmarkEnd w:id="18"/>
-      <w:proofErr w:type="spellEnd"/>
     </w:p>
     <w:p>
       <w:pPr>
@@ -9298,11 +8918,9 @@
             <w:tcW w:w="2181" w:type="dxa"/>
           </w:tcPr>
           <w:p>
-            <w:proofErr w:type="spellStart"/>
             <w:r>
               <w:t>HistorialId</w:t>
             </w:r>
-            <w:proofErr w:type="spellEnd"/>
           </w:p>
         </w:tc>
         <w:tc>
@@ -9321,13 +8939,8 @@
           </w:tcPr>
           <w:p>
             <w:r>
-              <w:t xml:space="preserve">PK, </w:t>
-            </w:r>
-            <w:proofErr w:type="spellStart"/>
-            <w:r>
-              <w:t>identity</w:t>
-            </w:r>
-            <w:proofErr w:type="spellEnd"/>
+              <w:t>PK, identity</w:t>
+            </w:r>
           </w:p>
         </w:tc>
         <w:tc>
@@ -9347,11 +8960,9 @@
             <w:tcW w:w="2181" w:type="dxa"/>
           </w:tcPr>
           <w:p>
-            <w:proofErr w:type="spellStart"/>
             <w:r>
               <w:t>IncidenciaId</w:t>
             </w:r>
-            <w:proofErr w:type="spellEnd"/>
           </w:p>
         </w:tc>
         <w:tc>
@@ -9384,16 +8995,8 @@
               <w:rPr>
                 <w:lang w:val="en-US"/>
               </w:rPr>
-              <w:t xml:space="preserve">, FK a </w:t>
-            </w:r>
-            <w:proofErr w:type="spellStart"/>
-            <w:r>
-              <w:rPr>
-                <w:lang w:val="en-US"/>
-              </w:rPr>
-              <w:t>Incidencia</w:t>
-            </w:r>
-            <w:proofErr w:type="spellEnd"/>
+              <w:t>, FK a Incidencia</w:t>
+            </w:r>
           </w:p>
         </w:tc>
         <w:tc>
@@ -9416,11 +9019,9 @@
             <w:tcW w:w="2181" w:type="dxa"/>
           </w:tcPr>
           <w:p>
-            <w:proofErr w:type="spellStart"/>
             <w:r>
               <w:t>EstadoOrigenId</w:t>
             </w:r>
-            <w:proofErr w:type="spellEnd"/>
           </w:p>
         </w:tc>
         <w:tc>
@@ -9439,13 +9040,8 @@
           </w:tcPr>
           <w:p>
             <w:r>
-              <w:t xml:space="preserve">NULL, FK a </w:t>
-            </w:r>
-            <w:proofErr w:type="spellStart"/>
-            <w:r>
-              <w:t>EstadoIncidencia</w:t>
-            </w:r>
-            <w:proofErr w:type="spellEnd"/>
+              <w:t>NULL, FK a EstadoIncidencia</w:t>
+            </w:r>
           </w:p>
         </w:tc>
         <w:tc>
@@ -9465,12 +9061,10 @@
             <w:tcW w:w="2181" w:type="dxa"/>
           </w:tcPr>
           <w:p>
-            <w:proofErr w:type="spellStart"/>
             <w:r>
               <w:lastRenderedPageBreak/>
               <w:t>EstadoDestinoId</w:t>
             </w:r>
-            <w:proofErr w:type="spellEnd"/>
           </w:p>
         </w:tc>
         <w:tc>
@@ -9492,13 +9086,8 @@
               <w:t>NOT NULL</w:t>
             </w:r>
             <w:r>
-              <w:t xml:space="preserve">, FK a </w:t>
-            </w:r>
-            <w:proofErr w:type="spellStart"/>
-            <w:r>
-              <w:t>EstadoIncidencia</w:t>
-            </w:r>
-            <w:proofErr w:type="spellEnd"/>
+              <w:t>, FK a EstadoIncidencia</w:t>
+            </w:r>
           </w:p>
         </w:tc>
         <w:tc>
@@ -9521,11 +9110,9 @@
             <w:tcW w:w="2181" w:type="dxa"/>
           </w:tcPr>
           <w:p>
-            <w:proofErr w:type="spellStart"/>
             <w:r>
               <w:t>Accion</w:t>
             </w:r>
-            <w:proofErr w:type="spellEnd"/>
           </w:p>
         </w:tc>
         <w:tc>
@@ -9568,11 +9155,9 @@
             <w:tcW w:w="2181" w:type="dxa"/>
           </w:tcPr>
           <w:p>
-            <w:proofErr w:type="spellStart"/>
             <w:r>
               <w:t>EmpleadoAccionId</w:t>
             </w:r>
-            <w:proofErr w:type="spellEnd"/>
           </w:p>
         </w:tc>
         <w:tc>
@@ -9605,16 +9190,8 @@
               <w:rPr>
                 <w:lang w:val="en-US"/>
               </w:rPr>
-              <w:t xml:space="preserve">, FK a </w:t>
-            </w:r>
-            <w:proofErr w:type="spellStart"/>
-            <w:r>
-              <w:rPr>
-                <w:lang w:val="en-US"/>
-              </w:rPr>
-              <w:t>Empleado</w:t>
-            </w:r>
-            <w:proofErr w:type="spellEnd"/>
+              <w:t>, FK a Empleado</w:t>
+            </w:r>
           </w:p>
         </w:tc>
         <w:tc>
@@ -9679,11 +9256,9 @@
             <w:tcW w:w="2181" w:type="dxa"/>
           </w:tcPr>
           <w:p>
-            <w:proofErr w:type="spellStart"/>
             <w:r>
               <w:t>FechaAccion</w:t>
             </w:r>
-            <w:proofErr w:type="spellEnd"/>
           </w:p>
         </w:tc>
         <w:tc>
@@ -9716,21 +9291,7 @@
               <w:rPr>
                 <w:lang w:val="en-US"/>
               </w:rPr>
-              <w:t xml:space="preserve">, default </w:t>
-            </w:r>
-            <w:proofErr w:type="spellStart"/>
-            <w:r>
-              <w:rPr>
-                <w:lang w:val="en-US"/>
-              </w:rPr>
-              <w:t>fecha</w:t>
-            </w:r>
-            <w:proofErr w:type="spellEnd"/>
-            <w:r>
-              <w:rPr>
-                <w:lang w:val="en-US"/>
-              </w:rPr>
-              <w:t xml:space="preserve"> actual</w:t>
+              <w:t>, default fecha actual</w:t>
             </w:r>
           </w:p>
         </w:tc>
@@ -9762,7 +9323,7 @@
           <w:lang w:eastAsia="es-MX"/>
         </w:rPr>
       </w:pPr>
-      <w:bookmarkStart w:id="19" w:name="_Toc244293427"/>
+      <w:bookmarkStart w:id="19" w:name="_Toc244295223"/>
       <w:r>
         <w:rPr>
           <w:lang w:eastAsia="es-MX"/>
@@ -9794,7 +9355,7 @@
           <w:lang w:eastAsia="es-MX"/>
         </w:rPr>
         <w:drawing>
-          <wp:inline distT="0" distB="0" distL="0" distR="0" wp14:anchorId="5A31EEC0" wp14:editId="3CE1D562">
+          <wp:inline distT="0" distB="0" distL="0" distR="0" wp14:anchorId="5A31EEC0" wp14:editId="574D4694">
             <wp:extent cx="2640762" cy="5245100"/>
             <wp:effectExtent l="0" t="0" r="7620" b="0"/>
             <wp:docPr id="2059752797" name="Imagen 2"/>
@@ -9967,11 +9528,9 @@
             <w:tcW w:w="1872" w:type="dxa"/>
           </w:tcPr>
           <w:p>
-            <w:proofErr w:type="spellStart"/>
             <w:r>
               <w:t>sp_registrar_incidencia</w:t>
             </w:r>
-            <w:proofErr w:type="spellEnd"/>
           </w:p>
         </w:tc>
         <w:tc>
@@ -10026,11 +9585,9 @@
             <w:tcW w:w="1872" w:type="dxa"/>
           </w:tcPr>
           <w:p>
-            <w:proofErr w:type="spellStart"/>
             <w:r>
               <w:t>sp_asignar_incidencia</w:t>
             </w:r>
-            <w:proofErr w:type="spellEnd"/>
           </w:p>
         </w:tc>
         <w:tc>
@@ -10083,11 +9640,9 @@
             <w:tcW w:w="1872" w:type="dxa"/>
           </w:tcPr>
           <w:p>
-            <w:proofErr w:type="spellStart"/>
             <w:r>
               <w:t>sp_iniciar_atencion</w:t>
             </w:r>
-            <w:proofErr w:type="spellEnd"/>
           </w:p>
         </w:tc>
         <w:tc>
@@ -10137,11 +9692,9 @@
             <w:tcW w:w="1872" w:type="dxa"/>
           </w:tcPr>
           <w:p>
-            <w:proofErr w:type="spellStart"/>
             <w:r>
               <w:t>sp_resolver_incidencia</w:t>
             </w:r>
-            <w:proofErr w:type="spellEnd"/>
           </w:p>
         </w:tc>
         <w:tc>
@@ -10361,7 +9914,7 @@
           <w:lang w:eastAsia="es-MX"/>
         </w:rPr>
       </w:pPr>
-      <w:bookmarkStart w:id="20" w:name="_Toc244293428"/>
+      <w:bookmarkStart w:id="20" w:name="_Toc244295224"/>
       <w:r>
         <w:rPr>
           <w:rFonts w:eastAsia="Times New Roman"/>
@@ -11571,6 +11124,7 @@
   <w:style w:type="character" w:default="1" w:styleId="Fuentedeprrafopredeter">
     <w:name w:val="Default Paragraph Font"/>
     <w:uiPriority w:val="1"/>
+    <w:semiHidden/>
     <w:unhideWhenUsed/>
   </w:style>
   <w:style w:type="table" w:default="1" w:styleId="Tablanormal">

</xml_diff>

<commit_message>
Actualiza estructura del proyecto y documento de pruebas
</commit_message>
<xml_diff>
--- a/documentacion/Diseño del sistema de gestión de incidencias.docx
+++ b/documentacion/Diseño del sistema de gestión de incidencias.docx
@@ -386,6 +386,29 @@
           <w:lang w:eastAsia="es-GT"/>
         </w:rPr>
       </w:pPr>
+      <w:r>
+        <w:rPr>
+          <w:rFonts w:eastAsia="Times New Roman" w:cs="Times New Roman"/>
+          <w:lang w:eastAsia="es-GT"/>
+        </w:rPr>
+        <w:t xml:space="preserve">Kendall Nathanael Mux </w:t>
+      </w:r>
+      <w:proofErr w:type="spellStart"/>
+      <w:r>
+        <w:rPr>
+          <w:rFonts w:eastAsia="Times New Roman" w:cs="Times New Roman"/>
+          <w:lang w:eastAsia="es-GT"/>
+        </w:rPr>
+        <w:t>Chex</w:t>
+      </w:r>
+      <w:proofErr w:type="spellEnd"/>
+      <w:r>
+        <w:rPr>
+          <w:rFonts w:eastAsia="Times New Roman" w:cs="Times New Roman"/>
+          <w:lang w:eastAsia="es-GT"/>
+        </w:rPr>
+        <w:t xml:space="preserve"> (000150250)</w:t>
+      </w:r>
     </w:p>
     <w:p>
       <w:pPr>
@@ -795,12 +818,21 @@
           <w:lang w:val="pt-BR" w:eastAsia="es-GT"/>
         </w:rPr>
       </w:pPr>
+      <w:proofErr w:type="spellStart"/>
       <w:r>
         <w:rPr>
           <w:rFonts w:eastAsia="Times New Roman" w:cs="Times New Roman"/>
           <w:lang w:val="pt-BR" w:eastAsia="es-GT"/>
         </w:rPr>
-        <w:t>Julio Edgar Barreda Ramírez (Docente)</w:t>
+        <w:t>Julio</w:t>
+      </w:r>
+      <w:proofErr w:type="spellEnd"/>
+      <w:r>
+        <w:rPr>
+          <w:rFonts w:eastAsia="Times New Roman" w:cs="Times New Roman"/>
+          <w:lang w:val="pt-BR" w:eastAsia="es-GT"/>
+        </w:rPr>
+        <w:t xml:space="preserve"> Edgar Barreda Ramírez (Docente)</w:t>
       </w:r>
     </w:p>
     <w:p>
@@ -3080,7 +3112,21 @@
         <w:rPr>
           <w:lang w:eastAsia="es-MX"/>
         </w:rPr>
-        <w:t>Aplicación móvil: Android con Kotlin.</w:t>
+        <w:t xml:space="preserve">Aplicación móvil: Android con </w:t>
+      </w:r>
+      <w:proofErr w:type="spellStart"/>
+      <w:r>
+        <w:rPr>
+          <w:lang w:eastAsia="es-MX"/>
+        </w:rPr>
+        <w:t>Kotlin</w:t>
+      </w:r>
+      <w:proofErr w:type="spellEnd"/>
+      <w:r>
+        <w:rPr>
+          <w:lang w:eastAsia="es-MX"/>
+        </w:rPr>
+        <w:t>.</w:t>
       </w:r>
     </w:p>
     <w:p>
@@ -3203,7 +3249,49 @@
         <w:rPr>
           <w:lang w:eastAsia="es-MX"/>
         </w:rPr>
-        <w:t>La base de datos tiene 8 entidades. Cuatro son catálogos (Empleado, TipoIncidencia, Prioridad y EstadoIncidencia), una es la tabla principal (Incidencia) y tres dependen de ella (Asignación, Fotografía e HistorialIncidencia).</w:t>
+        <w:t xml:space="preserve">La base de datos tiene 8 entidades. Cuatro son catálogos (Empleado, </w:t>
+      </w:r>
+      <w:proofErr w:type="spellStart"/>
+      <w:r>
+        <w:rPr>
+          <w:lang w:eastAsia="es-MX"/>
+        </w:rPr>
+        <w:t>TipoIncidencia</w:t>
+      </w:r>
+      <w:proofErr w:type="spellEnd"/>
+      <w:r>
+        <w:rPr>
+          <w:lang w:eastAsia="es-MX"/>
+        </w:rPr>
+        <w:t xml:space="preserve">, Prioridad y </w:t>
+      </w:r>
+      <w:proofErr w:type="spellStart"/>
+      <w:r>
+        <w:rPr>
+          <w:lang w:eastAsia="es-MX"/>
+        </w:rPr>
+        <w:t>EstadoIncidencia</w:t>
+      </w:r>
+      <w:proofErr w:type="spellEnd"/>
+      <w:r>
+        <w:rPr>
+          <w:lang w:eastAsia="es-MX"/>
+        </w:rPr>
+        <w:t xml:space="preserve">), una es la tabla principal (Incidencia) y tres dependen de ella (Asignación, Fotografía e </w:t>
+      </w:r>
+      <w:proofErr w:type="spellStart"/>
+      <w:r>
+        <w:rPr>
+          <w:lang w:eastAsia="es-MX"/>
+        </w:rPr>
+        <w:t>HistorialIncidencia</w:t>
+      </w:r>
+      <w:proofErr w:type="spellEnd"/>
+      <w:r>
+        <w:rPr>
+          <w:lang w:eastAsia="es-MX"/>
+        </w:rPr>
+        <w:t>).</w:t>
       </w:r>
     </w:p>
     <w:p>
@@ -3452,11 +3540,19 @@
                 <w:lang w:eastAsia="es-MX"/>
               </w:rPr>
             </w:pPr>
-            <w:r>
-              <w:rPr>
-                <w:lang w:eastAsia="es-MX"/>
-              </w:rPr>
-              <w:t xml:space="preserve">TipoIncidencia </w:t>
+            <w:proofErr w:type="spellStart"/>
+            <w:r>
+              <w:rPr>
+                <w:lang w:eastAsia="es-MX"/>
+              </w:rPr>
+              <w:t>TipoIncidencia</w:t>
+            </w:r>
+            <w:proofErr w:type="spellEnd"/>
+            <w:r>
+              <w:rPr>
+                <w:lang w:eastAsia="es-MX"/>
+              </w:rPr>
+              <w:t xml:space="preserve"> </w:t>
             </w:r>
             <w:r>
               <w:rPr>
@@ -3597,11 +3693,19 @@
                 <w:lang w:eastAsia="es-MX"/>
               </w:rPr>
             </w:pPr>
-            <w:r>
-              <w:rPr>
-                <w:lang w:eastAsia="es-MX"/>
-              </w:rPr>
-              <w:t xml:space="preserve">EstadoIncidencia </w:t>
+            <w:proofErr w:type="spellStart"/>
+            <w:r>
+              <w:rPr>
+                <w:lang w:eastAsia="es-MX"/>
+              </w:rPr>
+              <w:t>EstadoIncidencia</w:t>
+            </w:r>
+            <w:proofErr w:type="spellEnd"/>
+            <w:r>
+              <w:rPr>
+                <w:lang w:eastAsia="es-MX"/>
+              </w:rPr>
+              <w:t xml:space="preserve"> </w:t>
             </w:r>
             <w:r>
               <w:rPr>
@@ -3758,7 +3862,14 @@
               <w:rPr>
                 <w:lang w:eastAsia="es-MX"/>
               </w:rPr>
-              <w:t xml:space="preserve"> Asignaci</w:t>
+              <w:t xml:space="preserve"> </w:t>
+            </w:r>
+            <w:proofErr w:type="spellStart"/>
+            <w:r>
+              <w:rPr>
+                <w:lang w:eastAsia="es-MX"/>
+              </w:rPr>
+              <w:t>Asignaci</w:t>
             </w:r>
             <w:r>
               <w:rPr>
@@ -3772,6 +3883,7 @@
               </w:rPr>
               <w:t>n</w:t>
             </w:r>
+            <w:proofErr w:type="spellEnd"/>
           </w:p>
         </w:tc>
         <w:tc>
@@ -3859,7 +3971,14 @@
               <w:rPr>
                 <w:lang w:eastAsia="es-MX"/>
               </w:rPr>
-              <w:t xml:space="preserve"> Asignaci</w:t>
+              <w:t xml:space="preserve"> </w:t>
+            </w:r>
+            <w:proofErr w:type="spellStart"/>
+            <w:r>
+              <w:rPr>
+                <w:lang w:eastAsia="es-MX"/>
+              </w:rPr>
+              <w:t>Asignaci</w:t>
             </w:r>
             <w:r>
               <w:rPr>
@@ -3873,6 +3992,7 @@
               </w:rPr>
               <w:t>n</w:t>
             </w:r>
+            <w:proofErr w:type="spellEnd"/>
           </w:p>
         </w:tc>
         <w:tc>
@@ -3951,7 +4071,14 @@
               <w:rPr>
                 <w:lang w:eastAsia="es-MX"/>
               </w:rPr>
-              <w:t xml:space="preserve"> Fotograf</w:t>
+              <w:t xml:space="preserve"> </w:t>
+            </w:r>
+            <w:proofErr w:type="spellStart"/>
+            <w:r>
+              <w:rPr>
+                <w:lang w:eastAsia="es-MX"/>
+              </w:rPr>
+              <w:t>Fotograf</w:t>
             </w:r>
             <w:r>
               <w:rPr>
@@ -3965,6 +4092,7 @@
               </w:rPr>
               <w:t>a</w:t>
             </w:r>
+            <w:proofErr w:type="spellEnd"/>
           </w:p>
         </w:tc>
         <w:tc>
@@ -4034,8 +4162,16 @@
               <w:rPr>
                 <w:lang w:eastAsia="es-MX"/>
               </w:rPr>
-              <w:t xml:space="preserve"> HistorialIncidencia</w:t>
-            </w:r>
+              <w:t xml:space="preserve"> </w:t>
+            </w:r>
+            <w:proofErr w:type="spellStart"/>
+            <w:r>
+              <w:rPr>
+                <w:lang w:eastAsia="es-MX"/>
+              </w:rPr>
+              <w:t>HistorialIncidencia</w:t>
+            </w:r>
+            <w:proofErr w:type="spellEnd"/>
           </w:p>
         </w:tc>
         <w:tc>
@@ -4092,11 +4228,19 @@
                 <w:lang w:eastAsia="es-MX"/>
               </w:rPr>
             </w:pPr>
-            <w:r>
-              <w:rPr>
-                <w:lang w:eastAsia="es-MX"/>
-              </w:rPr>
-              <w:t xml:space="preserve">EstadoIncidencia </w:t>
+            <w:proofErr w:type="spellStart"/>
+            <w:r>
+              <w:rPr>
+                <w:lang w:eastAsia="es-MX"/>
+              </w:rPr>
+              <w:t>EstadoIncidencia</w:t>
+            </w:r>
+            <w:proofErr w:type="spellEnd"/>
+            <w:r>
+              <w:rPr>
+                <w:lang w:eastAsia="es-MX"/>
+              </w:rPr>
+              <w:t xml:space="preserve"> </w:t>
             </w:r>
             <w:r>
               <w:rPr>
@@ -4108,8 +4252,16 @@
               <w:rPr>
                 <w:lang w:eastAsia="es-MX"/>
               </w:rPr>
-              <w:t xml:space="preserve"> HistorialIncidencia</w:t>
-            </w:r>
+              <w:t xml:space="preserve"> </w:t>
+            </w:r>
+            <w:proofErr w:type="spellStart"/>
+            <w:r>
+              <w:rPr>
+                <w:lang w:eastAsia="es-MX"/>
+              </w:rPr>
+              <w:t>HistorialIncidencia</w:t>
+            </w:r>
+            <w:proofErr w:type="spellEnd"/>
           </w:p>
         </w:tc>
         <w:tc>
@@ -4179,8 +4331,16 @@
               <w:rPr>
                 <w:lang w:eastAsia="es-MX"/>
               </w:rPr>
-              <w:t xml:space="preserve"> HistorialIncidencia</w:t>
-            </w:r>
+              <w:t xml:space="preserve"> </w:t>
+            </w:r>
+            <w:proofErr w:type="spellStart"/>
+            <w:r>
+              <w:rPr>
+                <w:lang w:eastAsia="es-MX"/>
+              </w:rPr>
+              <w:t>HistorialIncidencia</w:t>
+            </w:r>
+            <w:proofErr w:type="spellEnd"/>
           </w:p>
         </w:tc>
         <w:tc>
@@ -4312,8 +4472,13 @@
           <w:numId w:val="3"/>
         </w:numPr>
       </w:pPr>
-      <w:r>
-        <w:t>identity: el número lo genera SQL Server solo, empieza en 1 y sube de 1 en 1.</w:t>
+      <w:proofErr w:type="spellStart"/>
+      <w:r>
+        <w:t>identity</w:t>
+      </w:r>
+      <w:proofErr w:type="spellEnd"/>
+      <w:r>
+        <w:t>: el número lo genera SQL Server solo, empieza en 1 y sube de 1 en 1.</w:t>
       </w:r>
     </w:p>
     <w:p>
@@ -4531,12 +4696,14 @@
                 <w:lang w:eastAsia="es-MX"/>
               </w:rPr>
             </w:pPr>
+            <w:proofErr w:type="spellStart"/>
             <w:r>
               <w:rPr>
                 <w:lang w:eastAsia="es-MX"/>
               </w:rPr>
               <w:t>EmpleadoId</w:t>
             </w:r>
+            <w:proofErr w:type="spellEnd"/>
           </w:p>
         </w:tc>
         <w:tc>
@@ -4573,8 +4740,16 @@
               <w:rPr>
                 <w:lang w:eastAsia="es-MX"/>
               </w:rPr>
-              <w:t>PK, identity</w:t>
-            </w:r>
+              <w:t xml:space="preserve">PK, </w:t>
+            </w:r>
+            <w:proofErr w:type="spellStart"/>
+            <w:r>
+              <w:rPr>
+                <w:lang w:eastAsia="es-MX"/>
+              </w:rPr>
+              <w:t>identity</w:t>
+            </w:r>
+            <w:proofErr w:type="spellEnd"/>
           </w:p>
         </w:tc>
         <w:tc>
@@ -4609,12 +4784,14 @@
                 <w:lang w:eastAsia="es-MX"/>
               </w:rPr>
             </w:pPr>
+            <w:proofErr w:type="spellStart"/>
             <w:r>
               <w:rPr>
                 <w:lang w:eastAsia="es-MX"/>
               </w:rPr>
               <w:t>NumeroEmpleado</w:t>
             </w:r>
+            <w:proofErr w:type="spellEnd"/>
           </w:p>
         </w:tc>
         <w:tc>
@@ -5068,6 +5245,7 @@
         </w:rPr>
       </w:pPr>
       <w:bookmarkStart w:id="12" w:name="_Toc244295216"/>
+      <w:proofErr w:type="spellStart"/>
       <w:r>
         <w:rPr>
           <w:lang w:eastAsia="es-MX"/>
@@ -5076,6 +5254,7 @@
         <w:t>TipoIncidencia</w:t>
       </w:r>
       <w:bookmarkEnd w:id="12"/>
+      <w:proofErr w:type="spellEnd"/>
     </w:p>
     <w:p>
       <w:pPr>
@@ -5204,6 +5383,7 @@
                 <w:lang w:eastAsia="es-MX"/>
               </w:rPr>
             </w:pPr>
+            <w:proofErr w:type="spellStart"/>
             <w:r>
               <w:rPr>
                 <w:lang w:eastAsia="es-MX"/>
@@ -5222,6 +5402,7 @@
               </w:rPr>
               <w:t>d</w:t>
             </w:r>
+            <w:proofErr w:type="spellEnd"/>
           </w:p>
         </w:tc>
         <w:tc>
@@ -5258,8 +5439,16 @@
               <w:rPr>
                 <w:lang w:eastAsia="es-MX"/>
               </w:rPr>
-              <w:t>PK, identity</w:t>
-            </w:r>
+              <w:t xml:space="preserve">PK, </w:t>
+            </w:r>
+            <w:proofErr w:type="spellStart"/>
+            <w:r>
+              <w:rPr>
+                <w:lang w:eastAsia="es-MX"/>
+              </w:rPr>
+              <w:t>identity</w:t>
+            </w:r>
+            <w:proofErr w:type="spellEnd"/>
           </w:p>
         </w:tc>
         <w:tc>
@@ -5711,6 +5900,7 @@
                 <w:lang w:eastAsia="es-MX"/>
               </w:rPr>
             </w:pPr>
+            <w:proofErr w:type="spellStart"/>
             <w:r>
               <w:rPr>
                 <w:lang w:eastAsia="es-MX"/>
@@ -5729,6 +5919,7 @@
               </w:rPr>
               <w:t>d</w:t>
             </w:r>
+            <w:proofErr w:type="spellEnd"/>
           </w:p>
         </w:tc>
         <w:tc>
@@ -5765,8 +5956,16 @@
               <w:rPr>
                 <w:lang w:eastAsia="es-MX"/>
               </w:rPr>
-              <w:t>PK, identity</w:t>
-            </w:r>
+              <w:t xml:space="preserve">PK, </w:t>
+            </w:r>
+            <w:proofErr w:type="spellStart"/>
+            <w:r>
+              <w:rPr>
+                <w:lang w:eastAsia="es-MX"/>
+              </w:rPr>
+              <w:t>identity</w:t>
+            </w:r>
+            <w:proofErr w:type="spellEnd"/>
           </w:p>
         </w:tc>
         <w:tc>
@@ -6218,6 +6417,7 @@
         </w:rPr>
       </w:pPr>
       <w:bookmarkStart w:id="14" w:name="_Toc244295218"/>
+      <w:proofErr w:type="spellStart"/>
       <w:r>
         <w:rPr>
           <w:lang w:eastAsia="es-MX"/>
@@ -6226,6 +6426,7 @@
         <w:t>EstadoIncidencia</w:t>
       </w:r>
       <w:bookmarkEnd w:id="14"/>
+      <w:proofErr w:type="spellEnd"/>
     </w:p>
     <w:p>
       <w:pPr>
@@ -6354,12 +6555,14 @@
                 <w:lang w:eastAsia="es-MX"/>
               </w:rPr>
             </w:pPr>
+            <w:proofErr w:type="spellStart"/>
             <w:r>
               <w:rPr>
                 <w:lang w:eastAsia="es-MX"/>
               </w:rPr>
               <w:t>EstadoId</w:t>
             </w:r>
+            <w:proofErr w:type="spellEnd"/>
           </w:p>
         </w:tc>
         <w:tc>
@@ -6396,8 +6599,16 @@
               <w:rPr>
                 <w:lang w:eastAsia="es-MX"/>
               </w:rPr>
-              <w:t>PK, identity</w:t>
-            </w:r>
+              <w:t xml:space="preserve">PK, </w:t>
+            </w:r>
+            <w:proofErr w:type="spellStart"/>
+            <w:r>
+              <w:rPr>
+                <w:lang w:eastAsia="es-MX"/>
+              </w:rPr>
+              <w:t>identity</w:t>
+            </w:r>
+            <w:proofErr w:type="spellEnd"/>
           </w:p>
         </w:tc>
         <w:tc>
@@ -6924,12 +7135,14 @@
                 <w:lang w:eastAsia="es-MX"/>
               </w:rPr>
             </w:pPr>
+            <w:proofErr w:type="spellStart"/>
             <w:r>
               <w:rPr>
                 <w:lang w:eastAsia="es-MX"/>
               </w:rPr>
               <w:t>IncidenciaId</w:t>
             </w:r>
+            <w:proofErr w:type="spellEnd"/>
           </w:p>
         </w:tc>
         <w:tc>
@@ -6966,8 +7179,16 @@
               <w:rPr>
                 <w:lang w:eastAsia="es-MX"/>
               </w:rPr>
-              <w:t>PK, identity</w:t>
-            </w:r>
+              <w:t xml:space="preserve">PK, </w:t>
+            </w:r>
+            <w:proofErr w:type="spellStart"/>
+            <w:r>
+              <w:rPr>
+                <w:lang w:eastAsia="es-MX"/>
+              </w:rPr>
+              <w:t>identity</w:t>
+            </w:r>
+            <w:proofErr w:type="spellEnd"/>
           </w:p>
         </w:tc>
         <w:tc>
@@ -7144,8 +7365,30 @@
               <w:rPr>
                 <w:lang w:val="en-US" w:eastAsia="es-MX"/>
               </w:rPr>
-              <w:t>, CHECK mínimo 5 caracteres</w:t>
-            </w:r>
+              <w:t xml:space="preserve">, CHECK </w:t>
+            </w:r>
+            <w:proofErr w:type="spellStart"/>
+            <w:r>
+              <w:rPr>
+                <w:lang w:val="en-US" w:eastAsia="es-MX"/>
+              </w:rPr>
+              <w:t>mínimo</w:t>
+            </w:r>
+            <w:proofErr w:type="spellEnd"/>
+            <w:r>
+              <w:rPr>
+                <w:lang w:val="en-US" w:eastAsia="es-MX"/>
+              </w:rPr>
+              <w:t xml:space="preserve"> 5 </w:t>
+            </w:r>
+            <w:proofErr w:type="spellStart"/>
+            <w:r>
+              <w:rPr>
+                <w:lang w:val="en-US" w:eastAsia="es-MX"/>
+              </w:rPr>
+              <w:t>caracteres</w:t>
+            </w:r>
+            <w:proofErr w:type="spellEnd"/>
           </w:p>
         </w:tc>
         <w:tc>
@@ -7180,12 +7423,14 @@
                 <w:lang w:eastAsia="es-MX"/>
               </w:rPr>
             </w:pPr>
+            <w:proofErr w:type="spellStart"/>
             <w:r>
               <w:rPr>
                 <w:lang w:eastAsia="es-MX"/>
               </w:rPr>
               <w:t>Descripcion</w:t>
             </w:r>
+            <w:proofErr w:type="spellEnd"/>
           </w:p>
         </w:tc>
         <w:tc>
@@ -7261,12 +7506,14 @@
                 <w:lang w:eastAsia="es-MX"/>
               </w:rPr>
             </w:pPr>
+            <w:proofErr w:type="spellStart"/>
             <w:r>
               <w:rPr>
                 <w:lang w:eastAsia="es-MX"/>
               </w:rPr>
               <w:t>TipoId</w:t>
             </w:r>
+            <w:proofErr w:type="spellEnd"/>
           </w:p>
         </w:tc>
         <w:tc>
@@ -7309,8 +7556,16 @@
               <w:rPr>
                 <w:lang w:val="en-US" w:eastAsia="es-MX"/>
               </w:rPr>
-              <w:t>, FK a TipoIncidencia</w:t>
-            </w:r>
+              <w:t xml:space="preserve">, FK a </w:t>
+            </w:r>
+            <w:proofErr w:type="spellStart"/>
+            <w:r>
+              <w:rPr>
+                <w:lang w:val="en-US" w:eastAsia="es-MX"/>
+              </w:rPr>
+              <w:t>TipoIncidencia</w:t>
+            </w:r>
+            <w:proofErr w:type="spellEnd"/>
           </w:p>
         </w:tc>
         <w:tc>
@@ -7345,12 +7600,14 @@
                 <w:lang w:eastAsia="es-MX"/>
               </w:rPr>
             </w:pPr>
+            <w:proofErr w:type="spellStart"/>
             <w:r>
               <w:rPr>
                 <w:lang w:eastAsia="es-MX"/>
               </w:rPr>
               <w:t>PrioridadId</w:t>
             </w:r>
+            <w:proofErr w:type="spellEnd"/>
           </w:p>
         </w:tc>
         <w:tc>
@@ -7393,8 +7650,16 @@
               <w:rPr>
                 <w:lang w:val="en-US" w:eastAsia="es-MX"/>
               </w:rPr>
-              <w:t>, FK a Prioridad</w:t>
-            </w:r>
+              <w:t xml:space="preserve">, FK a </w:t>
+            </w:r>
+            <w:proofErr w:type="spellStart"/>
+            <w:r>
+              <w:rPr>
+                <w:lang w:val="en-US" w:eastAsia="es-MX"/>
+              </w:rPr>
+              <w:t>Prioridad</w:t>
+            </w:r>
+            <w:proofErr w:type="spellEnd"/>
           </w:p>
         </w:tc>
         <w:tc>
@@ -7432,12 +7697,14 @@
                 <w:lang w:eastAsia="es-MX"/>
               </w:rPr>
             </w:pPr>
+            <w:proofErr w:type="spellStart"/>
             <w:r>
               <w:rPr>
                 <w:lang w:eastAsia="es-MX"/>
               </w:rPr>
               <w:t>EstadoId</w:t>
             </w:r>
+            <w:proofErr w:type="spellEnd"/>
           </w:p>
         </w:tc>
         <w:tc>
@@ -7480,8 +7747,16 @@
               <w:rPr>
                 <w:lang w:eastAsia="es-MX"/>
               </w:rPr>
-              <w:t>, FK a EstadoIncidencia</w:t>
-            </w:r>
+              <w:t xml:space="preserve">, FK a </w:t>
+            </w:r>
+            <w:proofErr w:type="spellStart"/>
+            <w:r>
+              <w:rPr>
+                <w:lang w:eastAsia="es-MX"/>
+              </w:rPr>
+              <w:t>EstadoIncidencia</w:t>
+            </w:r>
+            <w:proofErr w:type="spellEnd"/>
           </w:p>
         </w:tc>
         <w:tc>
@@ -7516,12 +7791,14 @@
                 <w:lang w:eastAsia="es-MX"/>
               </w:rPr>
             </w:pPr>
+            <w:proofErr w:type="spellStart"/>
             <w:r>
               <w:rPr>
                 <w:lang w:eastAsia="es-MX"/>
               </w:rPr>
               <w:t>ReportaEmpleadoId</w:t>
             </w:r>
+            <w:proofErr w:type="spellEnd"/>
           </w:p>
         </w:tc>
         <w:tc>
@@ -7564,8 +7841,16 @@
               <w:rPr>
                 <w:lang w:val="en-US" w:eastAsia="es-MX"/>
               </w:rPr>
-              <w:t>, FK a Empleado</w:t>
-            </w:r>
+              <w:t xml:space="preserve">, FK a </w:t>
+            </w:r>
+            <w:proofErr w:type="spellStart"/>
+            <w:r>
+              <w:rPr>
+                <w:lang w:val="en-US" w:eastAsia="es-MX"/>
+              </w:rPr>
+              <w:t>Empleado</w:t>
+            </w:r>
+            <w:proofErr w:type="spellEnd"/>
           </w:p>
         </w:tc>
         <w:tc>
@@ -7615,12 +7900,14 @@
                 <w:lang w:eastAsia="es-MX"/>
               </w:rPr>
             </w:pPr>
+            <w:proofErr w:type="spellStart"/>
             <w:r>
               <w:rPr>
                 <w:lang w:eastAsia="es-MX"/>
               </w:rPr>
               <w:t>FechaRegistro</w:t>
             </w:r>
+            <w:proofErr w:type="spellEnd"/>
           </w:p>
         </w:tc>
         <w:tc>
@@ -7663,7 +7950,21 @@
               <w:rPr>
                 <w:lang w:val="en-US" w:eastAsia="es-MX"/>
               </w:rPr>
-              <w:t>, default fecha actual</w:t>
+              <w:t xml:space="preserve">, default </w:t>
+            </w:r>
+            <w:proofErr w:type="spellStart"/>
+            <w:r>
+              <w:rPr>
+                <w:lang w:val="en-US" w:eastAsia="es-MX"/>
+              </w:rPr>
+              <w:t>fecha</w:t>
+            </w:r>
+            <w:proofErr w:type="spellEnd"/>
+            <w:r>
+              <w:rPr>
+                <w:lang w:val="en-US" w:eastAsia="es-MX"/>
+              </w:rPr>
+              <w:t xml:space="preserve"> actual</w:t>
             </w:r>
           </w:p>
         </w:tc>
@@ -7705,12 +8006,14 @@
                 <w:lang w:eastAsia="es-MX"/>
               </w:rPr>
             </w:pPr>
+            <w:proofErr w:type="spellStart"/>
             <w:r>
               <w:rPr>
                 <w:lang w:eastAsia="es-MX"/>
               </w:rPr>
               <w:t>Solucion</w:t>
             </w:r>
+            <w:proofErr w:type="spellEnd"/>
           </w:p>
         </w:tc>
         <w:tc>
@@ -7786,12 +8089,14 @@
                 <w:lang w:eastAsia="es-MX"/>
               </w:rPr>
             </w:pPr>
+            <w:proofErr w:type="spellStart"/>
             <w:r>
               <w:rPr>
                 <w:lang w:eastAsia="es-MX"/>
               </w:rPr>
               <w:t>FechaResolucion</w:t>
             </w:r>
+            <w:proofErr w:type="spellEnd"/>
           </w:p>
         </w:tc>
         <w:tc>
@@ -7951,6 +8256,7 @@
         </w:rPr>
       </w:pPr>
       <w:bookmarkStart w:id="16" w:name="_Toc244295220"/>
+      <w:proofErr w:type="spellStart"/>
       <w:r>
         <w:rPr>
           <w:lang w:eastAsia="es-MX"/>
@@ -7959,6 +8265,7 @@
         <w:t>Asignacion</w:t>
       </w:r>
       <w:bookmarkEnd w:id="16"/>
+      <w:proofErr w:type="spellEnd"/>
     </w:p>
     <w:p>
       <w:pPr>
@@ -8064,9 +8371,11 @@
             <w:tcW w:w="2340" w:type="dxa"/>
           </w:tcPr>
           <w:p>
+            <w:proofErr w:type="spellStart"/>
             <w:r>
               <w:t>AsignacionId</w:t>
             </w:r>
+            <w:proofErr w:type="spellEnd"/>
           </w:p>
         </w:tc>
         <w:tc>
@@ -8085,8 +8394,13 @@
           </w:tcPr>
           <w:p>
             <w:r>
-              <w:t>PK, identity</w:t>
-            </w:r>
+              <w:t xml:space="preserve">PK, </w:t>
+            </w:r>
+            <w:proofErr w:type="spellStart"/>
+            <w:r>
+              <w:t>identity</w:t>
+            </w:r>
+            <w:proofErr w:type="spellEnd"/>
           </w:p>
         </w:tc>
         <w:tc>
@@ -8106,9 +8420,11 @@
             <w:tcW w:w="2340" w:type="dxa"/>
           </w:tcPr>
           <w:p>
+            <w:proofErr w:type="spellStart"/>
             <w:r>
               <w:t>IncidenciaId</w:t>
             </w:r>
+            <w:proofErr w:type="spellEnd"/>
           </w:p>
         </w:tc>
         <w:tc>
@@ -8141,8 +8457,16 @@
               <w:rPr>
                 <w:lang w:val="en-US"/>
               </w:rPr>
-              <w:t>, FK a Incidencia</w:t>
-            </w:r>
+              <w:t xml:space="preserve">, FK a </w:t>
+            </w:r>
+            <w:proofErr w:type="spellStart"/>
+            <w:r>
+              <w:rPr>
+                <w:lang w:val="en-US"/>
+              </w:rPr>
+              <w:t>Incidencia</w:t>
+            </w:r>
+            <w:proofErr w:type="spellEnd"/>
           </w:p>
         </w:tc>
         <w:tc>
@@ -8165,9 +8489,11 @@
             <w:tcW w:w="2340" w:type="dxa"/>
           </w:tcPr>
           <w:p>
+            <w:proofErr w:type="spellStart"/>
             <w:r>
               <w:t>ResponsableEmpleadoId</w:t>
             </w:r>
+            <w:proofErr w:type="spellEnd"/>
           </w:p>
         </w:tc>
         <w:tc>
@@ -8200,8 +8526,16 @@
               <w:rPr>
                 <w:lang w:val="en-US"/>
               </w:rPr>
-              <w:t>, FK a Empleado</w:t>
-            </w:r>
+              <w:t xml:space="preserve">, FK a </w:t>
+            </w:r>
+            <w:proofErr w:type="spellStart"/>
+            <w:r>
+              <w:rPr>
+                <w:lang w:val="en-US"/>
+              </w:rPr>
+              <w:t>Empleado</w:t>
+            </w:r>
+            <w:proofErr w:type="spellEnd"/>
           </w:p>
         </w:tc>
         <w:tc>
@@ -8221,9 +8555,11 @@
             <w:tcW w:w="2340" w:type="dxa"/>
           </w:tcPr>
           <w:p>
+            <w:proofErr w:type="spellStart"/>
             <w:r>
               <w:t>AsignaEmpleadoId</w:t>
             </w:r>
+            <w:proofErr w:type="spellEnd"/>
           </w:p>
         </w:tc>
         <w:tc>
@@ -8256,8 +8592,16 @@
               <w:rPr>
                 <w:lang w:val="en-US"/>
               </w:rPr>
-              <w:t>, FK a Empleado</w:t>
-            </w:r>
+              <w:t xml:space="preserve">, FK a </w:t>
+            </w:r>
+            <w:proofErr w:type="spellStart"/>
+            <w:r>
+              <w:rPr>
+                <w:lang w:val="en-US"/>
+              </w:rPr>
+              <w:t>Empleado</w:t>
+            </w:r>
+            <w:proofErr w:type="spellEnd"/>
           </w:p>
         </w:tc>
         <w:tc>
@@ -8280,9 +8624,11 @@
             <w:tcW w:w="2340" w:type="dxa"/>
           </w:tcPr>
           <w:p>
+            <w:proofErr w:type="spellStart"/>
             <w:r>
               <w:t>FechaAsignacion</w:t>
             </w:r>
+            <w:proofErr w:type="spellEnd"/>
           </w:p>
         </w:tc>
         <w:tc>
@@ -8315,7 +8661,21 @@
               <w:rPr>
                 <w:lang w:val="en-US"/>
               </w:rPr>
-              <w:t>, default fecha actual</w:t>
+              <w:t xml:space="preserve">, default </w:t>
+            </w:r>
+            <w:proofErr w:type="spellStart"/>
+            <w:r>
+              <w:rPr>
+                <w:lang w:val="en-US"/>
+              </w:rPr>
+              <w:t>fecha</w:t>
+            </w:r>
+            <w:proofErr w:type="spellEnd"/>
+            <w:r>
+              <w:rPr>
+                <w:lang w:val="en-US"/>
+              </w:rPr>
+              <w:t xml:space="preserve"> actual</w:t>
             </w:r>
           </w:p>
         </w:tc>
@@ -8429,6 +8789,7 @@
         </w:rPr>
       </w:pPr>
       <w:bookmarkStart w:id="17" w:name="_Toc244295221"/>
+      <w:proofErr w:type="spellStart"/>
       <w:r>
         <w:rPr>
           <w:lang w:eastAsia="es-MX"/>
@@ -8436,6 +8797,7 @@
         <w:t>Fotografia</w:t>
       </w:r>
       <w:bookmarkEnd w:id="17"/>
+      <w:proofErr w:type="spellEnd"/>
     </w:p>
     <w:p>
       <w:pPr>
@@ -8517,9 +8879,11 @@
             <w:tcW w:w="2307" w:type="dxa"/>
           </w:tcPr>
           <w:p>
+            <w:proofErr w:type="spellStart"/>
             <w:r>
               <w:t>FotografiaId</w:t>
             </w:r>
+            <w:proofErr w:type="spellEnd"/>
           </w:p>
         </w:tc>
         <w:tc>
@@ -8538,8 +8902,13 @@
           </w:tcPr>
           <w:p>
             <w:r>
-              <w:t>PK, identity</w:t>
-            </w:r>
+              <w:t xml:space="preserve">PK, </w:t>
+            </w:r>
+            <w:proofErr w:type="spellStart"/>
+            <w:r>
+              <w:t>identity</w:t>
+            </w:r>
+            <w:proofErr w:type="spellEnd"/>
           </w:p>
         </w:tc>
         <w:tc>
@@ -8559,10 +8928,12 @@
             <w:tcW w:w="2307" w:type="dxa"/>
           </w:tcPr>
           <w:p>
+            <w:proofErr w:type="spellStart"/>
             <w:r>
               <w:lastRenderedPageBreak/>
               <w:t>IncidenciaId</w:t>
             </w:r>
+            <w:proofErr w:type="spellEnd"/>
           </w:p>
         </w:tc>
         <w:tc>
@@ -8595,8 +8966,16 @@
               <w:rPr>
                 <w:lang w:val="en-US"/>
               </w:rPr>
-              <w:t>, FK a Incidencia</w:t>
-            </w:r>
+              <w:t xml:space="preserve">, FK a </w:t>
+            </w:r>
+            <w:proofErr w:type="spellStart"/>
+            <w:r>
+              <w:rPr>
+                <w:lang w:val="en-US"/>
+              </w:rPr>
+              <w:t>Incidencia</w:t>
+            </w:r>
+            <w:proofErr w:type="spellEnd"/>
           </w:p>
         </w:tc>
         <w:tc>
@@ -8619,9 +8998,11 @@
             <w:tcW w:w="2307" w:type="dxa"/>
           </w:tcPr>
           <w:p>
+            <w:proofErr w:type="spellStart"/>
             <w:r>
               <w:t>TipoEvidencia</w:t>
             </w:r>
+            <w:proofErr w:type="spellEnd"/>
           </w:p>
         </w:tc>
         <w:tc>
@@ -8675,9 +9056,11 @@
             <w:tcW w:w="2307" w:type="dxa"/>
           </w:tcPr>
           <w:p>
+            <w:proofErr w:type="spellStart"/>
             <w:r>
               <w:t>UrlAlmacenamiento</w:t>
             </w:r>
+            <w:proofErr w:type="spellEnd"/>
           </w:p>
         </w:tc>
         <w:tc>
@@ -8720,9 +9103,11 @@
             <w:tcW w:w="2307" w:type="dxa"/>
           </w:tcPr>
           <w:p>
+            <w:proofErr w:type="spellStart"/>
             <w:r>
               <w:t>NombreArchivo</w:t>
             </w:r>
+            <w:proofErr w:type="spellEnd"/>
           </w:p>
         </w:tc>
         <w:tc>
@@ -8762,9 +9147,11 @@
             <w:tcW w:w="2307" w:type="dxa"/>
           </w:tcPr>
           <w:p>
+            <w:proofErr w:type="spellStart"/>
             <w:r>
               <w:t>FechaCaptura</w:t>
             </w:r>
+            <w:proofErr w:type="spellEnd"/>
           </w:p>
         </w:tc>
         <w:tc>
@@ -8797,7 +9184,21 @@
               <w:rPr>
                 <w:lang w:val="en-US"/>
               </w:rPr>
-              <w:t>, default fecha actual</w:t>
+              <w:t xml:space="preserve">, default </w:t>
+            </w:r>
+            <w:proofErr w:type="spellStart"/>
+            <w:r>
+              <w:rPr>
+                <w:lang w:val="en-US"/>
+              </w:rPr>
+              <w:t>fecha</w:t>
+            </w:r>
+            <w:proofErr w:type="spellEnd"/>
+            <w:r>
+              <w:rPr>
+                <w:lang w:val="en-US"/>
+              </w:rPr>
+              <w:t xml:space="preserve"> actual</w:t>
             </w:r>
           </w:p>
         </w:tc>
@@ -8830,6 +9231,7 @@
         </w:rPr>
       </w:pPr>
       <w:bookmarkStart w:id="18" w:name="_Toc244295222"/>
+      <w:proofErr w:type="spellStart"/>
       <w:r>
         <w:rPr>
           <w:lang w:eastAsia="es-MX"/>
@@ -8837,6 +9239,7 @@
         <w:t>HistorialIncidencia</w:t>
       </w:r>
       <w:bookmarkEnd w:id="18"/>
+      <w:proofErr w:type="spellEnd"/>
     </w:p>
     <w:p>
       <w:pPr>
@@ -8918,9 +9321,11 @@
             <w:tcW w:w="2181" w:type="dxa"/>
           </w:tcPr>
           <w:p>
+            <w:proofErr w:type="spellStart"/>
             <w:r>
               <w:t>HistorialId</w:t>
             </w:r>
+            <w:proofErr w:type="spellEnd"/>
           </w:p>
         </w:tc>
         <w:tc>
@@ -8939,8 +9344,13 @@
           </w:tcPr>
           <w:p>
             <w:r>
-              <w:t>PK, identity</w:t>
-            </w:r>
+              <w:t xml:space="preserve">PK, </w:t>
+            </w:r>
+            <w:proofErr w:type="spellStart"/>
+            <w:r>
+              <w:t>identity</w:t>
+            </w:r>
+            <w:proofErr w:type="spellEnd"/>
           </w:p>
         </w:tc>
         <w:tc>
@@ -8960,9 +9370,11 @@
             <w:tcW w:w="2181" w:type="dxa"/>
           </w:tcPr>
           <w:p>
+            <w:proofErr w:type="spellStart"/>
             <w:r>
               <w:t>IncidenciaId</w:t>
             </w:r>
+            <w:proofErr w:type="spellEnd"/>
           </w:p>
         </w:tc>
         <w:tc>
@@ -8995,8 +9407,16 @@
               <w:rPr>
                 <w:lang w:val="en-US"/>
               </w:rPr>
-              <w:t>, FK a Incidencia</w:t>
-            </w:r>
+              <w:t xml:space="preserve">, FK a </w:t>
+            </w:r>
+            <w:proofErr w:type="spellStart"/>
+            <w:r>
+              <w:rPr>
+                <w:lang w:val="en-US"/>
+              </w:rPr>
+              <w:t>Incidencia</w:t>
+            </w:r>
+            <w:proofErr w:type="spellEnd"/>
           </w:p>
         </w:tc>
         <w:tc>
@@ -9019,9 +9439,11 @@
             <w:tcW w:w="2181" w:type="dxa"/>
           </w:tcPr>
           <w:p>
+            <w:proofErr w:type="spellStart"/>
             <w:r>
               <w:t>EstadoOrigenId</w:t>
             </w:r>
+            <w:proofErr w:type="spellEnd"/>
           </w:p>
         </w:tc>
         <w:tc>
@@ -9040,8 +9462,13 @@
           </w:tcPr>
           <w:p>
             <w:r>
-              <w:t>NULL, FK a EstadoIncidencia</w:t>
-            </w:r>
+              <w:t xml:space="preserve">NULL, FK a </w:t>
+            </w:r>
+            <w:proofErr w:type="spellStart"/>
+            <w:r>
+              <w:t>EstadoIncidencia</w:t>
+            </w:r>
+            <w:proofErr w:type="spellEnd"/>
           </w:p>
         </w:tc>
         <w:tc>
@@ -9061,10 +9488,12 @@
             <w:tcW w:w="2181" w:type="dxa"/>
           </w:tcPr>
           <w:p>
+            <w:proofErr w:type="spellStart"/>
             <w:r>
               <w:lastRenderedPageBreak/>
               <w:t>EstadoDestinoId</w:t>
             </w:r>
+            <w:proofErr w:type="spellEnd"/>
           </w:p>
         </w:tc>
         <w:tc>
@@ -9086,8 +9515,13 @@
               <w:t>NOT NULL</w:t>
             </w:r>
             <w:r>
-              <w:t>, FK a EstadoIncidencia</w:t>
-            </w:r>
+              <w:t xml:space="preserve">, FK a </w:t>
+            </w:r>
+            <w:proofErr w:type="spellStart"/>
+            <w:r>
+              <w:t>EstadoIncidencia</w:t>
+            </w:r>
+            <w:proofErr w:type="spellEnd"/>
           </w:p>
         </w:tc>
         <w:tc>
@@ -9110,9 +9544,11 @@
             <w:tcW w:w="2181" w:type="dxa"/>
           </w:tcPr>
           <w:p>
+            <w:proofErr w:type="spellStart"/>
             <w:r>
               <w:t>Accion</w:t>
             </w:r>
+            <w:proofErr w:type="spellEnd"/>
           </w:p>
         </w:tc>
         <w:tc>
@@ -9155,9 +9591,11 @@
             <w:tcW w:w="2181" w:type="dxa"/>
           </w:tcPr>
           <w:p>
+            <w:proofErr w:type="spellStart"/>
             <w:r>
               <w:t>EmpleadoAccionId</w:t>
             </w:r>
+            <w:proofErr w:type="spellEnd"/>
           </w:p>
         </w:tc>
         <w:tc>
@@ -9190,8 +9628,16 @@
               <w:rPr>
                 <w:lang w:val="en-US"/>
               </w:rPr>
-              <w:t>, FK a Empleado</w:t>
-            </w:r>
+              <w:t xml:space="preserve">, FK a </w:t>
+            </w:r>
+            <w:proofErr w:type="spellStart"/>
+            <w:r>
+              <w:rPr>
+                <w:lang w:val="en-US"/>
+              </w:rPr>
+              <w:t>Empleado</w:t>
+            </w:r>
+            <w:proofErr w:type="spellEnd"/>
           </w:p>
         </w:tc>
         <w:tc>
@@ -9256,9 +9702,11 @@
             <w:tcW w:w="2181" w:type="dxa"/>
           </w:tcPr>
           <w:p>
+            <w:proofErr w:type="spellStart"/>
             <w:r>
               <w:t>FechaAccion</w:t>
             </w:r>
+            <w:proofErr w:type="spellEnd"/>
           </w:p>
         </w:tc>
         <w:tc>
@@ -9291,7 +9739,21 @@
               <w:rPr>
                 <w:lang w:val="en-US"/>
               </w:rPr>
-              <w:t>, default fecha actual</w:t>
+              <w:t xml:space="preserve">, default </w:t>
+            </w:r>
+            <w:proofErr w:type="spellStart"/>
+            <w:r>
+              <w:rPr>
+                <w:lang w:val="en-US"/>
+              </w:rPr>
+              <w:t>fecha</w:t>
+            </w:r>
+            <w:proofErr w:type="spellEnd"/>
+            <w:r>
+              <w:rPr>
+                <w:lang w:val="en-US"/>
+              </w:rPr>
+              <w:t xml:space="preserve"> actual</w:t>
             </w:r>
           </w:p>
         </w:tc>
@@ -9355,7 +9817,7 @@
           <w:lang w:eastAsia="es-MX"/>
         </w:rPr>
         <w:drawing>
-          <wp:inline distT="0" distB="0" distL="0" distR="0" wp14:anchorId="5A31EEC0" wp14:editId="574D4694">
+          <wp:inline distT="0" distB="0" distL="0" distR="0" wp14:anchorId="5A31EEC0" wp14:editId="3D9FC9E1">
             <wp:extent cx="2640762" cy="5245100"/>
             <wp:effectExtent l="0" t="0" r="7620" b="0"/>
             <wp:docPr id="2059752797" name="Imagen 2"/>
@@ -9528,9 +9990,11 @@
             <w:tcW w:w="1872" w:type="dxa"/>
           </w:tcPr>
           <w:p>
+            <w:proofErr w:type="spellStart"/>
             <w:r>
               <w:t>sp_registrar_incidencia</w:t>
             </w:r>
+            <w:proofErr w:type="spellEnd"/>
           </w:p>
         </w:tc>
         <w:tc>
@@ -9585,9 +10049,11 @@
             <w:tcW w:w="1872" w:type="dxa"/>
           </w:tcPr>
           <w:p>
+            <w:proofErr w:type="spellStart"/>
             <w:r>
               <w:t>sp_asignar_incidencia</w:t>
             </w:r>
+            <w:proofErr w:type="spellEnd"/>
           </w:p>
         </w:tc>
         <w:tc>
@@ -9640,9 +10106,11 @@
             <w:tcW w:w="1872" w:type="dxa"/>
           </w:tcPr>
           <w:p>
+            <w:proofErr w:type="spellStart"/>
             <w:r>
               <w:t>sp_iniciar_atencion</w:t>
             </w:r>
+            <w:proofErr w:type="spellEnd"/>
           </w:p>
         </w:tc>
         <w:tc>
@@ -9692,9 +10160,11 @@
             <w:tcW w:w="1872" w:type="dxa"/>
           </w:tcPr>
           <w:p>
+            <w:proofErr w:type="spellStart"/>
             <w:r>
               <w:t>sp_resolver_incidencia</w:t>
             </w:r>
+            <w:proofErr w:type="spellEnd"/>
           </w:p>
         </w:tc>
         <w:tc>

</xml_diff>